<commit_message>
FYP: cada video independiente, con llamado a la acción y bookeaa como solución
- Fuente única fyp/octubre.py y generadores (md, csv, Word).
- Sin "Parte 1/2/3": cada video lleva gancho, conexión, solución y CTA.
- Archivos renombrados a -MG / -VOZ / -CAM.

Co-Authored-By: Claude Opus 5.5 <noreply@anthropic.com>
Claude-Session: https://claude.ai/code/session_01KPbJmtELNHpLa4Dqf9k4h4
</commit_message>
<xml_diff>
--- a/marketing/personal/Guiones-octubre-bookeaa.docx
+++ b/marketing/personal/Guiones-octubre-bookeaa.docx
@@ -41,7 +41,7 @@
           <w:sz w:val="22"/>
           <w:szCs w:val="22"/>
         </w:rPr>
-        <w:t xml:space="preserve">Tienes que grabar 17 audios y 17 videos a cámara. Cada guion tiene el nombre exacto con el que lo subes a Drive. Los videos P1 (sin voz) los hago yo.</w:t>
+        <w:t xml:space="preserve">Tienes que grabar 17 audios y 17 videos a cámara. Cada video funciona solo: tiene su gancho, conecta con el problema del negocio, presenta bookeaa como la solución y termina con un llamado a la acción. Los videos MG (sin voz) los hago yo.</w:t>
       </w:r>
     </w:p>
     <w:p>
@@ -67,7 +67,7 @@
           <w:sz w:val="22"/>
           <w:szCs w:val="22"/>
         </w:rPr>
-        <w:t xml:space="preserve">🎙️ Audios (P2)</w:t>
+        <w:t xml:space="preserve">🎙️ Audios (VOZ)</w:t>
       </w:r>
     </w:p>
     <w:p>
@@ -85,7 +85,7 @@
           <w:sz w:val="21"/>
           <w:szCs w:val="21"/>
         </w:rPr>
-        <w:t xml:space="preserve">Grábalos en un cuarto con ropa, cortinas o cojines (absorben el eco).</w:t>
+        <w:t xml:space="preserve">Grábalos en un cuarto con ropa, cortinas o cojines (absorben el eco), con el teléfono a un palmo de la boca.</w:t>
       </w:r>
     </w:p>
     <w:p>
@@ -103,7 +103,7 @@
           <w:sz w:val="21"/>
           <w:szCs w:val="21"/>
         </w:rPr>
-        <w:t xml:space="preserve">Teléfono a un palmo de la boca, con la app de notas de voz o la grabadora.</w:t>
+        <w:t xml:space="preserve">La primera frase es el gancho: dila con fuerza, como si interrumpieras una conversación.</w:t>
       </w:r>
     </w:p>
     <w:p>
@@ -154,7 +154,7 @@
           <w:sz w:val="22"/>
           <w:szCs w:val="22"/>
         </w:rPr>
-        <w:t xml:space="preserve">🎥 Videos a cámara (P3)</w:t>
+        <w:t xml:space="preserve">🎥 Videos a cámara (CAM)</w:t>
       </w:r>
     </w:p>
     <w:p>
@@ -172,7 +172,7 @@
           <w:sz w:val="21"/>
           <w:szCs w:val="21"/>
         </w:rPr>
-        <w:t xml:space="preserve">Vertical, en 1080p o 4K, con luz de frente (una ventana o una lámpara detrás del teléfono).</w:t>
+        <w:t xml:space="preserve">Vertical, en 1080p o 4K, con luz de frente. Manda el archivo original, no por WhatsApp.</w:t>
       </w:r>
     </w:p>
     <w:p>
@@ -226,7 +226,22 @@
           <w:sz w:val="21"/>
           <w:szCs w:val="21"/>
         </w:rPr>
-        <w:t xml:space="preserve">Cambia de camiseta entre días para que no parezca el mismo video.</w:t>
+        <w:t xml:space="preserve">Cambia de camiseta entre días. Si te equivocas, repite la frase desde el principio: yo corto.</w:t>
+      </w:r>
+    </w:p>
+    <w:p>
+      <w:pPr>
+        <w:spacing w:after="60" w:before="160"/>
+      </w:pPr>
+      <w:r>
+        <w:rPr>
+          <w:rFonts w:ascii="Arial" w:cs="Arial" w:eastAsia="Arial" w:hAnsi="Arial"/>
+          <w:b/>
+          <w:bCs/>
+          <w:sz w:val="22"/>
+          <w:szCs w:val="22"/>
+        </w:rPr>
+        <w:t xml:space="preserve">📁 Para subir</w:t>
       </w:r>
     </w:p>
     <w:p>
@@ -244,22 +259,7 @@
           <w:sz w:val="21"/>
           <w:szCs w:val="21"/>
         </w:rPr>
-        <w:t xml:space="preserve">Si te equivocas, no cortes: repite la frase desde el principio. Yo corto lo que sobra.</w:t>
-      </w:r>
-    </w:p>
-    <w:p>
-      <w:pPr>
-        <w:spacing w:after="60" w:before="160"/>
-      </w:pPr>
-      <w:r>
-        <w:rPr>
-          <w:rFonts w:ascii="Arial" w:cs="Arial" w:eastAsia="Arial" w:hAnsi="Arial"/>
-          <w:b/>
-          <w:bCs/>
-          <w:sz w:val="22"/>
-          <w:szCs w:val="22"/>
-        </w:rPr>
-        <w:t xml:space="preserve">📁 Para subir</w:t>
+        <w:t xml:space="preserve">Nombra cada archivo exactamente como el título del guion (por ejemplo, FYP-S00-JUE-VOZ.m4a).</w:t>
       </w:r>
     </w:p>
     <w:p>
@@ -277,55 +277,37 @@
           <w:sz w:val="21"/>
           <w:szCs w:val="21"/>
         </w:rPr>
-        <w:t xml:space="preserve">Nombra cada archivo exactamente como el título del guion (por ejemplo, FYP-S00-JUE-P2.m4a).</w:t>
-      </w:r>
-    </w:p>
-    <w:p>
-      <w:pPr>
-        <w:pStyle w:val="ListParagraph"/>
-        <w:numPr>
-          <w:ilvl w:val="0"/>
-          <w:numId w:val="2"/>
-        </w:numPr>
-        <w:spacing w:after="60"/>
-      </w:pPr>
-      <w:r>
-        <w:rPr>
-          <w:rFonts w:ascii="Arial" w:cs="Arial" w:eastAsia="Arial" w:hAnsi="Arial"/>
+        <w:t xml:space="preserve">Súbelos a una carpeta de Drive compartida con "Cualquier persona con el enlace" y mándame el link de la carpeta.</w:t>
+      </w:r>
+    </w:p>
+    <w:p>
+      <w:r>
+        <w:br w:type="page"/>
+      </w:r>
+    </w:p>
+    <w:p>
+      <w:pPr>
+        <w:pStyle w:val="Heading1"/>
+      </w:pPr>
+      <w:r>
+        <w:rPr>
+          <w:rFonts w:ascii="Arial" w:cs="Arial" w:eastAsia="Arial" w:hAnsi="Arial"/>
+        </w:rPr>
+        <w:t xml:space="preserve">Sesión 1 · Hoy</w:t>
+      </w:r>
+    </w:p>
+    <w:p>
+      <w:pPr>
+        <w:spacing w:after="200"/>
+      </w:pPr>
+      <w:r>
+        <w:rPr>
+          <w:rFonts w:ascii="Arial" w:cs="Arial" w:eastAsia="Arial" w:hAnsi="Arial"/>
+          <w:color w:val="5B5B57"/>
           <w:sz w:val="21"/>
           <w:szCs w:val="21"/>
         </w:rPr>
-        <w:t xml:space="preserve">Súbelos a una carpeta de Drive compartida con "Cualquier persona con el enlace" y mándame el link de la carpeta.</w:t>
-      </w:r>
-    </w:p>
-    <w:p>
-      <w:r>
-        <w:br w:type="page"/>
-      </w:r>
-    </w:p>
-    <w:p>
-      <w:pPr>
-        <w:pStyle w:val="Heading1"/>
-      </w:pPr>
-      <w:r>
-        <w:rPr>
-          <w:rFonts w:ascii="Arial" w:cs="Arial" w:eastAsia="Arial" w:hAnsi="Arial"/>
-        </w:rPr>
-        <w:t xml:space="preserve">Sesión 1 · Hoy (miércoles 7)</w:t>
-      </w:r>
-    </w:p>
-    <w:p>
-      <w:pPr>
-        <w:spacing w:after="200"/>
-      </w:pPr>
-      <w:r>
-        <w:rPr>
-          <w:rFonts w:ascii="Arial" w:cs="Arial" w:eastAsia="Arial" w:hAnsi="Arial"/>
-          <w:color w:val="5B5B57"/>
-          <w:sz w:val="21"/>
-          <w:szCs w:val="21"/>
-        </w:rPr>
-        <w:t xml:space="preserve">Semana 0: jueves 8 y viernes 9. Pásamelo antes del jueves a las 10 a. m.</w:t>
+        <w:t xml:space="preserve">Semana 0: jueves 8 y viernes 9 de octubre. Pásamelo antes del jueves a las 10 a. m.</w:t>
       </w:r>
     </w:p>
     <w:p>
@@ -353,7 +335,7 @@
         <w:rPr>
           <w:rFonts w:ascii="Arial" w:cs="Arial" w:eastAsia="Arial" w:hAnsi="Arial"/>
         </w:rPr>
-        <w:t xml:space="preserve">FYP-S00-JUE-P2.m4a</w:t>
+        <w:t xml:space="preserve">FYP-S00-JUE-VOZ.m4a</w:t>
       </w:r>
     </w:p>
     <w:p>
@@ -368,7 +350,7 @@
           <w:sz w:val="18"/>
           <w:szCs w:val="18"/>
         </w:rPr>
-        <w:t xml:space="preserve">🎙️ AUDIO  ·  Por qué el DM no alcanza  ·  sale el jueves 8 de octubre, 1:00 p. m.</w:t>
+        <w:t xml:space="preserve">🎙️ AUDIO  ·  El que espera, se va  ·  sale el jueves 8 de octubre, 1:00 p. m.</w:t>
       </w:r>
     </w:p>
     <w:p>
@@ -404,7 +386,24 @@
           <w:sz w:val="28"/>
           <w:szCs w:val="28"/>
         </w:rPr>
-        <w:t xml:space="preserve">«'Escríbeme al DM' significa que tu cliente tiene que esperarte. Y el que espera, se va. Un link en la bio deja que reserve en el momento en que le dieron ganas.»</w:t>
+        <w:t xml:space="preserve">«¿Tu bio dice "escríbeme al DM"? Eso significa que tu cliente tiene que esperarte… y el que espera, se va. Los negocios que saben organizar su tiempo ponen un link donde el cliente reserva solo, en el momento en que le dieron ganas.»</w:t>
+      </w:r>
+    </w:p>
+    <w:p>
+      <w:pPr>
+        <w:keepNext/>
+        <w:spacing w:after="40"/>
+      </w:pPr>
+      <w:r>
+        <w:rPr>
+          <w:rFonts w:ascii="Arial" w:cs="Arial" w:eastAsia="Arial" w:hAnsi="Arial"/>
+          <w:i/>
+          <w:iCs/>
+          <w:color w:val="5B5B57"/>
+          <w:sz w:val="17"/>
+          <w:szCs w:val="17"/>
+        </w:rPr>
+        <w:t xml:space="preserve">Gancho en pantalla: ¿TU BIO DICE "ESCRÍBEME AL DM"?</w:t>
       </w:r>
     </w:p>
     <w:p>
@@ -421,7 +420,7 @@
           <w:sz w:val="17"/>
           <w:szCs w:val="17"/>
         </w:rPr>
-        <w:t xml:space="preserve">En pantalla: EL QUE ESPERA, SE VA.</w:t>
+        <w:t xml:space="preserve">Imagen: Chat con "¿tienes hora?" y un reloj que avanza sin respuesta.</w:t>
       </w:r>
     </w:p>
     <w:p>
@@ -447,7 +446,7 @@
         <w:rPr>
           <w:rFonts w:ascii="Arial" w:cs="Arial" w:eastAsia="Arial" w:hAnsi="Arial"/>
         </w:rPr>
-        <w:t xml:space="preserve">FYP-S00-VIE-P2.m4a</w:t>
+        <w:t xml:space="preserve">FYP-S00-VIE-VOZ.m4a</w:t>
       </w:r>
     </w:p>
     <w:p>
@@ -462,7 +461,7 @@
           <w:sz w:val="18"/>
           <w:szCs w:val="18"/>
         </w:rPr>
-        <w:t xml:space="preserve">🎙️ AUDIO  ·  Lo que lleva  ·  sale el viernes 9 de octubre, 1:00 p. m.</w:t>
+        <w:t xml:space="preserve">🎙️ AUDIO  ·  Todo en un link  ·  sale el viernes 9 de octubre, 1:00 p. m.</w:t>
       </w:r>
     </w:p>
     <w:p>
@@ -498,7 +497,24 @@
           <w:sz w:val="28"/>
           <w:szCs w:val="28"/>
         </w:rPr>
-        <w:t xml:space="preserve">«Tu página lleva tu nombre, tus servicios con precio, tus horarios y tu ubicación. Tu cliente entra, elige y reserva. Así de simple.»</w:t>
+        <w:t xml:space="preserve">«Precio, dirección, horario, si tienes hora… tu cliente te pregunta lo mismo todos los días. Con bookeaa todo eso está en una sola página con tu nombre: entra, elige y reserva. Así se ve un negocio organizado.»</w:t>
+      </w:r>
+    </w:p>
+    <w:p>
+      <w:pPr>
+        <w:keepNext/>
+        <w:spacing w:after="40"/>
+      </w:pPr>
+      <w:r>
+        <w:rPr>
+          <w:rFonts w:ascii="Arial" w:cs="Arial" w:eastAsia="Arial" w:hAnsi="Arial"/>
+          <w:i/>
+          <w:iCs/>
+          <w:color w:val="5B5B57"/>
+          <w:sz w:val="17"/>
+          <w:szCs w:val="17"/>
+        </w:rPr>
+        <w:t xml:space="preserve">Gancho en pantalla: ¿TU CLIENTE TIENE QUE PREGUNTARTE TODO?</w:t>
       </w:r>
     </w:p>
     <w:p>
@@ -515,7 +531,7 @@
           <w:sz w:val="17"/>
           <w:szCs w:val="17"/>
         </w:rPr>
-        <w:t xml:space="preserve">Animación: checklist que se marca: nombre ✓, servicios ✓, horarios ✓, ubicación ✓.</w:t>
+        <w:t xml:space="preserve">Imagen: Burbujas: "¿precio?", "¿dónde quedas?", "¿tienes hora?"… que se convierten en una sola página.</w:t>
       </w:r>
     </w:p>
     <w:p>
@@ -556,7 +572,7 @@
         <w:rPr>
           <w:rFonts w:ascii="Arial" w:cs="Arial" w:eastAsia="Arial" w:hAnsi="Arial"/>
         </w:rPr>
-        <w:t xml:space="preserve">FYP-S00-JUE-P3.mp4</w:t>
+        <w:t xml:space="preserve">FYP-S00-JUE-CAM.mp4</w:t>
       </w:r>
     </w:p>
     <w:p>
@@ -571,7 +587,7 @@
           <w:sz w:val="18"/>
           <w:szCs w:val="18"/>
         </w:rPr>
-        <w:t xml:space="preserve">🎥 VIDEO A CÁMARA  ·  Mi consejo  ·  sale el jueves 8 de octubre, 8:30 p. m.</w:t>
+        <w:t xml:space="preserve">🎥 VIDEO A CÁMARA  ·  Revisa tu bio hoy  ·  sale el jueves 8 de octubre, 8:30 p. m.</w:t>
       </w:r>
     </w:p>
     <w:p>
@@ -607,7 +623,24 @@
           <w:sz w:val="28"/>
           <w:szCs w:val="28"/>
         </w:rPr>
-        <w:t xml:space="preserve">«Si tienes un negocio con citas, revisa tu bio ahora mismo. Si dice 'escríbeme al DM', estás dejando ir clientes. Cámbialo por un link donde reserven solos.»</w:t>
+        <w:t xml:space="preserve">«Si tienes un negocio con citas, revisa tu bio ahora mismo. Si dice "escríbeme al DM", estás dejando ir clientes todos los días. Cámbialo por un link donde reserven solos. Yo creé bookeaa justo para eso: el link está en mi perfil y el primer mes es gratis.»</w:t>
+      </w:r>
+    </w:p>
+    <w:p>
+      <w:pPr>
+        <w:keepNext/>
+        <w:spacing w:after="40"/>
+      </w:pPr>
+      <w:r>
+        <w:rPr>
+          <w:rFonts w:ascii="Arial" w:cs="Arial" w:eastAsia="Arial" w:hAnsi="Arial"/>
+          <w:i/>
+          <w:iCs/>
+          <w:color w:val="5B5B57"/>
+          <w:sz w:val="17"/>
+          <w:szCs w:val="17"/>
+        </w:rPr>
+        <w:t xml:space="preserve">Gancho en pantalla: REVISA TU BIO AHORA MISMO.</w:t>
       </w:r>
     </w:p>
     <w:p>
@@ -624,7 +657,7 @@
           <w:sz w:val="17"/>
           <w:szCs w:val="17"/>
         </w:rPr>
-        <w:t xml:space="preserve">Animación: pastilla "REVISA TU BIO HOY."</w:t>
+        <w:t xml:space="preserve">Cómo grabarlo: Tú, plano cerca, señalando el teléfono.</w:t>
       </w:r>
     </w:p>
     <w:p>
@@ -650,7 +683,7 @@
         <w:rPr>
           <w:rFonts w:ascii="Arial" w:cs="Arial" w:eastAsia="Arial" w:hAnsi="Arial"/>
         </w:rPr>
-        <w:t xml:space="preserve">FYP-S00-VIE-P3.mp4</w:t>
+        <w:t xml:space="preserve">FYP-S00-VIE-CAM.mp4</w:t>
       </w:r>
     </w:p>
     <w:p>
@@ -665,7 +698,7 @@
           <w:sz w:val="18"/>
           <w:szCs w:val="18"/>
         </w:rPr>
-        <w:t xml:space="preserve">🎥 VIDEO A CÁMARA  ·  Mi primera semana  ·  sale el viernes 9 de octubre, 8:30 p. m.</w:t>
+        <w:t xml:space="preserve">🎥 VIDEO A CÁMARA  ·  Por qué lancé bookeaa  ·  sale el viernes 9 de octubre, 8:30 p. m.</w:t>
       </w:r>
     </w:p>
     <w:p>
@@ -701,7 +734,24 @@
           <w:sz w:val="28"/>
           <w:szCs w:val="28"/>
         </w:rPr>
-        <w:t xml:space="preserve">«Esta semana lancé bookeaa, y a partir del lunes subo tres videos diarios para ayudarte con tu agenda. Sígueme para no perderte ninguno.»</w:t>
+        <w:t xml:space="preserve">«Esta semana lancé bookeaa porque vi a demasiados negocios buenos perdiendo clientes por no responder a tiempo. Tu cliente entra a tu link, ve tus horas libres y reserva solo. Sígueme: todos los días te comparto cómo organizar mejor tu agenda.»</w:t>
+      </w:r>
+    </w:p>
+    <w:p>
+      <w:pPr>
+        <w:keepNext/>
+        <w:spacing w:after="40"/>
+      </w:pPr>
+      <w:r>
+        <w:rPr>
+          <w:rFonts w:ascii="Arial" w:cs="Arial" w:eastAsia="Arial" w:hAnsi="Arial"/>
+          <w:i/>
+          <w:iCs/>
+          <w:color w:val="5B5B57"/>
+          <w:sz w:val="17"/>
+          <w:szCs w:val="17"/>
+        </w:rPr>
+        <w:t xml:space="preserve">Gancho en pantalla: ESTA SEMANA LANCÉ ESTO.</w:t>
       </w:r>
     </w:p>
     <w:p>
@@ -718,7 +768,7 @@
           <w:sz w:val="17"/>
           <w:szCs w:val="17"/>
         </w:rPr>
-        <w:t xml:space="preserve">En pantalla: 3 VIDEOS DIARIOS. SÍGUEME.</w:t>
+        <w:t xml:space="preserve">Cómo grabarlo: Tú a cámara; al final, el teléfono con la página de reservas.</w:t>
       </w:r>
     </w:p>
     <w:p>
@@ -789,7 +839,7 @@
         <w:rPr>
           <w:rFonts w:ascii="Arial" w:cs="Arial" w:eastAsia="Arial" w:hAnsi="Arial"/>
         </w:rPr>
-        <w:t xml:space="preserve">FYP-S01-LUN-P2.m4a</w:t>
+        <w:t xml:space="preserve">FYP-S01-LUN-VOZ.m4a</w:t>
       </w:r>
     </w:p>
     <w:p>
@@ -804,7 +854,7 @@
           <w:sz w:val="18"/>
           <w:szCs w:val="18"/>
         </w:rPr>
-        <w:t xml:space="preserve">🎙️ AUDIO  ·  Por qué pasa  ·  sale el lunes 12 de octubre, 1:00 p. m.</w:t>
+        <w:t xml:space="preserve">🎙️ AUDIO  ·  No es mala suerte  ·  sale el lunes 12 de octubre, 1:00 p. m.</w:t>
       </w:r>
     </w:p>
     <w:p>
@@ -840,7 +890,24 @@
           <w:sz w:val="28"/>
           <w:szCs w:val="28"/>
         </w:rPr>
-        <w:t xml:space="preserve">«Si te pasó, no es mala suerte. Cuando la cita se queda en un chat, el cliente no la tiene en ningún lado. Se le olvida. Cuando la cita queda en su calendario… llega.»</w:t>
+        <w:t xml:space="preserve">«Si tus clientes te dejan plantado, no es mala suerte: es cómo agendas. Cuando la cita se queda en un chat, el cliente no la tiene en ningún lado y se le olvida. Con bookeaa la cita queda en su Google Calendar. Por eso los negocios organizados agendan así.»</w:t>
+      </w:r>
+    </w:p>
+    <w:p>
+      <w:pPr>
+        <w:keepNext/>
+        <w:spacing w:after="40"/>
+      </w:pPr>
+      <w:r>
+        <w:rPr>
+          <w:rFonts w:ascii="Arial" w:cs="Arial" w:eastAsia="Arial" w:hAnsi="Arial"/>
+          <w:i/>
+          <w:iCs/>
+          <w:color w:val="5B5B57"/>
+          <w:sz w:val="17"/>
+          <w:szCs w:val="17"/>
+        </w:rPr>
+        <w:t xml:space="preserve">Gancho en pantalla: NO ES MALA SUERTE. ES CÓMO AGENDAS.</w:t>
       </w:r>
     </w:p>
     <w:p>
@@ -857,7 +924,7 @@
           <w:sz w:val="17"/>
           <w:szCs w:val="17"/>
         </w:rPr>
-        <w:t xml:space="preserve">En pantalla: NO ES MALA SUERTE. ES CÓMO AGENDAS.   ·   Animación: la silla vacía de la P1 se convierte en un calendario.</w:t>
+        <w:t xml:space="preserve">Imagen: Una silla vacía que se convierte en un calendario lleno.</w:t>
       </w:r>
     </w:p>
     <w:p>
@@ -883,7 +950,7 @@
         <w:rPr>
           <w:rFonts w:ascii="Arial" w:cs="Arial" w:eastAsia="Arial" w:hAnsi="Arial"/>
         </w:rPr>
-        <w:t xml:space="preserve">FYP-S01-MAR-P2.m4a</w:t>
+        <w:t xml:space="preserve">FYP-S01-MAR-VOZ.m4a</w:t>
       </w:r>
     </w:p>
     <w:p>
@@ -898,7 +965,7 @@
           <w:sz w:val="18"/>
           <w:szCs w:val="18"/>
         </w:rPr>
-        <w:t xml:space="preserve">🎙️ AUDIO  ·  La cuenta  ·  sale el martes 13 de octubre, 1:00 p. m.</w:t>
+        <w:t xml:space="preserve">🎙️ AUDIO  ·  Hagamos la cuenta  ·  sale el martes 13 de octubre, 1:00 p. m.</w:t>
       </w:r>
     </w:p>
     <w:p>
@@ -934,7 +1001,24 @@
           <w:sz w:val="28"/>
           <w:szCs w:val="28"/>
         </w:rPr>
-        <w:t xml:space="preserve">«Si pierdes un cliente a la semana por no responder a tiempo, son cuatro al mes. Cuarenta y ocho al año. Ahora multiplícalo por lo que cobras.»</w:t>
+        <w:t xml:space="preserve">«Si pierdes un solo cliente a la semana por no responder a tiempo, son cuatro al mes, cuarenta y ocho al año. Multiplícalo por lo que cobras. Los negocios que saben organizar su tiempo no compiten contestando más rápido: dejan que el cliente reserve solo. Eso es bookeaa.»</w:t>
+      </w:r>
+    </w:p>
+    <w:p>
+      <w:pPr>
+        <w:keepNext/>
+        <w:spacing w:after="40"/>
+      </w:pPr>
+      <w:r>
+        <w:rPr>
+          <w:rFonts w:ascii="Arial" w:cs="Arial" w:eastAsia="Arial" w:hAnsi="Arial"/>
+          <w:i/>
+          <w:iCs/>
+          <w:color w:val="5B5B57"/>
+          <w:sz w:val="17"/>
+          <w:szCs w:val="17"/>
+        </w:rPr>
+        <w:t xml:space="preserve">Gancho en pantalla: HAGAMOS UNA CUENTA QUE DUELE.</w:t>
       </w:r>
     </w:p>
     <w:p>
@@ -951,7 +1035,7 @@
           <w:sz w:val="17"/>
           <w:szCs w:val="17"/>
         </w:rPr>
-        <w:t xml:space="preserve">En pantalla: HAGAMOS LA CUENTA.   ·   Animación: números gigantes que van sumando.</w:t>
+        <w:t xml:space="preserve">Imagen: Números gigantes: 1 → 4 → 48, con monedas cayendo.</w:t>
       </w:r>
     </w:p>
     <w:p>
@@ -977,7 +1061,7 @@
         <w:rPr>
           <w:rFonts w:ascii="Arial" w:cs="Arial" w:eastAsia="Arial" w:hAnsi="Arial"/>
         </w:rPr>
-        <w:t xml:space="preserve">FYP-S01-MIE-P2.m4a</w:t>
+        <w:t xml:space="preserve">FYP-S01-MIE-VOZ.m4a</w:t>
       </w:r>
     </w:p>
     <w:p>
@@ -992,7 +1076,7 @@
           <w:sz w:val="18"/>
           <w:szCs w:val="18"/>
         </w:rPr>
-        <w:t xml:space="preserve">🎙️ AUDIO  ·  La que duele  ·  sale el miércoles 14 de octubre, 1:00 p. m.</w:t>
+        <w:t xml:space="preserve">🎙️ AUDIO  ·  Dos horas que no vuelven  ·  sale el miércoles 14 de octubre, 1:00 p. m.</w:t>
       </w:r>
     </w:p>
     <w:p>
@@ -1028,7 +1112,24 @@
           <w:sz w:val="28"/>
           <w:szCs w:val="28"/>
         </w:rPr>
-        <w:t xml:space="preserve">«Un set de uñas te ocupa dos horas. Si la clienta no llega, perdiste las dos horas y el material que preparaste. Por eso la cita tiene que quedar confirmada y en el calendario de las dos.»</w:t>
+        <w:t xml:space="preserve">«Si haces uñas, un set te ocupa dos horas. Si la clienta no llega, perdiste las dos horas y el material que preparaste. Por eso las manicuristas organizadas confirman cada cita en el calendario de las dos. Con bookeaa pasa solo.»</w:t>
+      </w:r>
+    </w:p>
+    <w:p>
+      <w:pPr>
+        <w:keepNext/>
+        <w:spacing w:after="40"/>
+      </w:pPr>
+      <w:r>
+        <w:rPr>
+          <w:rFonts w:ascii="Arial" w:cs="Arial" w:eastAsia="Arial" w:hAnsi="Arial"/>
+          <w:i/>
+          <w:iCs/>
+          <w:color w:val="5B5B57"/>
+          <w:sz w:val="17"/>
+          <w:szCs w:val="17"/>
+        </w:rPr>
+        <w:t xml:space="preserve">Gancho en pantalla: SI HACES UÑAS, ESTO TE VA A DOLER.</w:t>
       </w:r>
     </w:p>
     <w:p>
@@ -1045,7 +1146,7 @@
           <w:sz w:val="17"/>
           <w:szCs w:val="17"/>
         </w:rPr>
-        <w:t xml:space="preserve">En pantalla: UNA CITA SIN CONFIRMAR NO ES UNA CITA.</w:t>
+        <w:t xml:space="preserve">Imagen: Un reloj de 2 horas que se vacía; una mesa de manicure vacía.</w:t>
       </w:r>
     </w:p>
     <w:p>
@@ -1071,7 +1172,7 @@
         <w:rPr>
           <w:rFonts w:ascii="Arial" w:cs="Arial" w:eastAsia="Arial" w:hAnsi="Arial"/>
         </w:rPr>
-        <w:t xml:space="preserve">FYP-S01-JUE-P2.m4a</w:t>
+        <w:t xml:space="preserve">FYP-S01-JUE-VOZ.m4a</w:t>
       </w:r>
     </w:p>
     <w:p>
@@ -1086,7 +1187,7 @@
           <w:sz w:val="18"/>
           <w:szCs w:val="18"/>
         </w:rPr>
-        <w:t xml:space="preserve">🎙️ AUDIO  ·  Lo que se pierde  ·  sale el jueves 15 de octubre, 1:00 p. m.</w:t>
+        <w:t xml:space="preserve">🎙️ AUDIO  ·  Tu cliente no ve tu libreta  ·  sale el jueves 15 de octubre, 1:00 p. m.</w:t>
       </w:r>
     </w:p>
     <w:p>
@@ -1122,7 +1223,24 @@
           <w:sz w:val="28"/>
           <w:szCs w:val="28"/>
         </w:rPr>
-        <w:t xml:space="preserve">«Una libreta se pierde, se moja y no te avisa nada. Y lo peor: tu cliente no la puede ver. Te tiene que escribir para saber si tienes hora.»</w:t>
+        <w:t xml:space="preserve">«Si tu agenda está en una libreta, tu cliente no la puede ver. Te tiene que escribir solo para saber si tienes hora. Los negocios que saben organizar su tiempo muestran sus horas libres en un link, y el cliente reserva solo. Eso es bookeaa.»</w:t>
+      </w:r>
+    </w:p>
+    <w:p>
+      <w:pPr>
+        <w:keepNext/>
+        <w:spacing w:after="40"/>
+      </w:pPr>
+      <w:r>
+        <w:rPr>
+          <w:rFonts w:ascii="Arial" w:cs="Arial" w:eastAsia="Arial" w:hAnsi="Arial"/>
+          <w:i/>
+          <w:iCs/>
+          <w:color w:val="5B5B57"/>
+          <w:sz w:val="17"/>
+          <w:szCs w:val="17"/>
+        </w:rPr>
+        <w:t xml:space="preserve">Gancho en pantalla: ¿TU AGENDA ESTÁ EN UN PAPEL?</w:t>
       </w:r>
     </w:p>
     <w:p>
@@ -1139,7 +1257,7 @@
           <w:sz w:val="17"/>
           <w:szCs w:val="17"/>
         </w:rPr>
-        <w:t xml:space="preserve">En pantalla: TU CLIENTE NO PUEDE VER TU LIBRETA.</w:t>
+        <w:t xml:space="preserve">Imagen: Libreta que se transforma en un teléfono con horas libres.</w:t>
       </w:r>
     </w:p>
     <w:p>
@@ -1165,7 +1283,7 @@
         <w:rPr>
           <w:rFonts w:ascii="Arial" w:cs="Arial" w:eastAsia="Arial" w:hAnsi="Arial"/>
         </w:rPr>
-        <w:t xml:space="preserve">FYP-S01-VIE-P2.m4a</w:t>
+        <w:t xml:space="preserve">FYP-S01-VIE-VOZ.m4a</w:t>
       </w:r>
     </w:p>
     <w:p>
@@ -1180,7 +1298,7 @@
           <w:sz w:val="18"/>
           <w:szCs w:val="18"/>
         </w:rPr>
-        <w:t xml:space="preserve">🎙️ AUDIO  ·  Lo que pasa después  ·  sale el viernes 16 de octubre, 1:00 p. m.</w:t>
+        <w:t xml:space="preserve">🎙️ AUDIO  ·  Cero mensajes  ·  sale el viernes 16 de octubre, 1:00 p. m.</w:t>
       </w:r>
     </w:p>
     <w:p>
@@ -1216,7 +1334,24 @@
           <w:sz w:val="28"/>
           <w:szCs w:val="28"/>
         </w:rPr>
-        <w:t xml:space="preserve">«Y cuando reserva, la cita cae sola en tu Google Calendar y en el de tu cliente. Tú no escribiste ni un mensaje.»</w:t>
+        <w:t xml:space="preserve">«¿Cuántos mensajes escribes para agendar una cita? ¿Diez? Con bookeaa son cero: tu cliente elige servicio y hora, y la cita cae sola en tu Google Calendar y en el suyo. Así trabajan los negocios que valoran su tiempo.»</w:t>
+      </w:r>
+    </w:p>
+    <w:p>
+      <w:pPr>
+        <w:keepNext/>
+        <w:spacing w:after="40"/>
+      </w:pPr>
+      <w:r>
+        <w:rPr>
+          <w:rFonts w:ascii="Arial" w:cs="Arial" w:eastAsia="Arial" w:hAnsi="Arial"/>
+          <w:i/>
+          <w:iCs/>
+          <w:color w:val="5B5B57"/>
+          <w:sz w:val="17"/>
+          <w:szCs w:val="17"/>
+        </w:rPr>
+        <w:t xml:space="preserve">Gancho en pantalla: ¿CUÁNTOS MENSAJES ESCRIBES PARA UNA CITA?</w:t>
       </w:r>
     </w:p>
     <w:p>
@@ -1233,7 +1368,7 @@
           <w:sz w:val="17"/>
           <w:szCs w:val="17"/>
         </w:rPr>
-        <w:t xml:space="preserve">Animación: tarjeta de Calendar + "0 MENSAJES."</w:t>
+        <w:t xml:space="preserve">Imagen: Contador de mensajes que baja de 10 a 0; tarjeta de Google Calendar.</w:t>
       </w:r>
     </w:p>
     <w:p>
@@ -1259,7 +1394,7 @@
         <w:rPr>
           <w:rFonts w:ascii="Arial" w:cs="Arial" w:eastAsia="Arial" w:hAnsi="Arial"/>
         </w:rPr>
-        <w:t xml:space="preserve">FYP-S02-LUN-P2.m4a</w:t>
+        <w:t xml:space="preserve">FYP-S02-LUN-VOZ.m4a</w:t>
       </w:r>
     </w:p>
     <w:p>
@@ -1274,7 +1409,7 @@
           <w:sz w:val="18"/>
           <w:szCs w:val="18"/>
         </w:rPr>
-        <w:t xml:space="preserve">🎙️ AUDIO  ·  Por qué pasa  ·  sale el lunes 19 de octubre, 1:00 p. m.</w:t>
+        <w:t xml:space="preserve">🎙️ AUDIO  ·  Tres agendas = caos  ·  sale el lunes 19 de octubre, 1:00 p. m.</w:t>
       </w:r>
     </w:p>
     <w:p>
@@ -1310,7 +1445,24 @@
           <w:sz w:val="28"/>
           <w:szCs w:val="28"/>
         </w:rPr>
-        <w:t xml:space="preserve">«Pasa porque agendas en tres lugares distintos: el WhatsApp, Instagram y tu cabeza. Si todo vive en un solo calendario, ese choque no puede pasar.»</w:t>
+        <w:t xml:space="preserve">«Si te cruzan citas, es porque agendas en tres lugares a la vez: WhatsApp, Instagram y tu cabeza. Los negocios organizados tienen un solo calendario, y el cliente solo ve las horas que de verdad están libres. Eso es bookeaa.»</w:t>
+      </w:r>
+    </w:p>
+    <w:p>
+      <w:pPr>
+        <w:keepNext/>
+        <w:spacing w:after="40"/>
+      </w:pPr>
+      <w:r>
+        <w:rPr>
+          <w:rFonts w:ascii="Arial" w:cs="Arial" w:eastAsia="Arial" w:hAnsi="Arial"/>
+          <w:i/>
+          <w:iCs/>
+          <w:color w:val="5B5B57"/>
+          <w:sz w:val="17"/>
+          <w:szCs w:val="17"/>
+        </w:rPr>
+        <w:t xml:space="preserve">Gancho en pantalla: WHATSAPP + INSTAGRAM + TU CABEZA = CAOS.</w:t>
       </w:r>
     </w:p>
     <w:p>
@@ -1327,7 +1479,7 @@
           <w:sz w:val="17"/>
           <w:szCs w:val="17"/>
         </w:rPr>
-        <w:t xml:space="preserve">En pantalla: WHATSAPP + INSTAGRAM + TU CABEZA = CAOS.</w:t>
+        <w:t xml:space="preserve">Imagen: Tres íconos que se juntan y explotan; queda un solo calendario.</w:t>
       </w:r>
     </w:p>
     <w:p>
@@ -1353,7 +1505,7 @@
         <w:rPr>
           <w:rFonts w:ascii="Arial" w:cs="Arial" w:eastAsia="Arial" w:hAnsi="Arial"/>
         </w:rPr>
-        <w:t xml:space="preserve">FYP-S02-MAR-P2.m4a</w:t>
+        <w:t xml:space="preserve">FYP-S02-MAR-VOZ.m4a</w:t>
       </w:r>
     </w:p>
     <w:p>
@@ -1404,7 +1556,41 @@
           <w:sz w:val="28"/>
           <w:szCs w:val="28"/>
         </w:rPr>
-        <w:t xml:space="preserve">«Muchos clientes no preguntan el precio por pena… y se van con alguien que sí lo muestra. Si tus precios están a la vista, el que reserva ya sabe cuánto paga.»</w:t>
+        <w:t xml:space="preserve">«Muchos clientes no preguntan el precio por pena, y se van con alguien que sí lo muestra. Los negocios que saben vender ponen sus servicios con precio a la vista. En bookeaa tu cliente ve todo, elige y reserva, sin preguntas incómodas.»</w:t>
+      </w:r>
+    </w:p>
+    <w:p>
+      <w:pPr>
+        <w:keepNext/>
+        <w:spacing w:after="40"/>
+      </w:pPr>
+      <w:r>
+        <w:rPr>
+          <w:rFonts w:ascii="Arial" w:cs="Arial" w:eastAsia="Arial" w:hAnsi="Arial"/>
+          <w:i/>
+          <w:iCs/>
+          <w:color w:val="5B5B57"/>
+          <w:sz w:val="17"/>
+          <w:szCs w:val="17"/>
+        </w:rPr>
+        <w:t xml:space="preserve">Gancho en pantalla: EL CLIENTE QUE NO PREGUNTA, SE VA.</w:t>
+      </w:r>
+    </w:p>
+    <w:p>
+      <w:pPr>
+        <w:keepNext/>
+        <w:spacing w:after="60"/>
+      </w:pPr>
+      <w:r>
+        <w:rPr>
+          <w:rFonts w:ascii="Arial" w:cs="Arial" w:eastAsia="Arial" w:hAnsi="Arial"/>
+          <w:i/>
+          <w:iCs/>
+          <w:color w:val="5B5B57"/>
+          <w:sz w:val="17"/>
+          <w:szCs w:val="17"/>
+        </w:rPr>
+        <w:t xml:space="preserve">Imagen: Una persona que mira el perfil, duda y se va.</w:t>
       </w:r>
     </w:p>
     <w:p>
@@ -1430,7 +1616,7 @@
         <w:rPr>
           <w:rFonts w:ascii="Arial" w:cs="Arial" w:eastAsia="Arial" w:hAnsi="Arial"/>
         </w:rPr>
-        <w:t xml:space="preserve">FYP-S02-MIE-P2.m4a</w:t>
+        <w:t xml:space="preserve">FYP-S02-MIE-VOZ.m4a</w:t>
       </w:r>
     </w:p>
     <w:p>
@@ -1445,7 +1631,7 @@
           <w:sz w:val="18"/>
           <w:szCs w:val="18"/>
         </w:rPr>
-        <w:t xml:space="preserve">🎙️ AUDIO  ·  El de las 9 p. m.  ·  sale el miércoles 21 de octubre, 1:00 p. m.</w:t>
+        <w:t xml:space="preserve">🎙️ AUDIO  ·  El cliente de las 9 p. m.  ·  sale el miércoles 21 de octubre, 1:00 p. m.</w:t>
       </w:r>
     </w:p>
     <w:p>
@@ -1481,7 +1667,41 @@
           <w:sz w:val="28"/>
           <w:szCs w:val="28"/>
         </w:rPr>
-        <w:t xml:space="preserve">«El cliente que escribe a las nueve de la noche quiere reservar YA. Si no le respondes, mañana se corta con otro. Con un link, reserva aunque estés dormido.»</w:t>
+        <w:t xml:space="preserve">«El cliente que te escribe a las nueve de la noche quiere reservar ya. Si no le respondes, mañana se corta con otro. Los barberos organizados tienen un link donde reservan aunque ellos estén dormidos. Eso es bookeaa.»</w:t>
+      </w:r>
+    </w:p>
+    <w:p>
+      <w:pPr>
+        <w:keepNext/>
+        <w:spacing w:after="40"/>
+      </w:pPr>
+      <w:r>
+        <w:rPr>
+          <w:rFonts w:ascii="Arial" w:cs="Arial" w:eastAsia="Arial" w:hAnsi="Arial"/>
+          <w:i/>
+          <w:iCs/>
+          <w:color w:val="5B5B57"/>
+          <w:sz w:val="17"/>
+          <w:szCs w:val="17"/>
+        </w:rPr>
+        <w:t xml:space="preserve">Gancho en pantalla: BARBERO: EL CLIENTE DE LAS 9 P. M. NO TE VA A ESPERAR.</w:t>
+      </w:r>
+    </w:p>
+    <w:p>
+      <w:pPr>
+        <w:keepNext/>
+        <w:spacing w:after="60"/>
+      </w:pPr>
+      <w:r>
+        <w:rPr>
+          <w:rFonts w:ascii="Arial" w:cs="Arial" w:eastAsia="Arial" w:hAnsi="Arial"/>
+          <w:i/>
+          <w:iCs/>
+          <w:color w:val="5B5B57"/>
+          <w:sz w:val="17"/>
+          <w:szCs w:val="17"/>
+        </w:rPr>
+        <w:t xml:space="preserve">Imagen: Reloj 9:00 p. m., chat sin respuesta, otra barbería que responde.</w:t>
       </w:r>
     </w:p>
     <w:p>
@@ -1507,7 +1727,7 @@
         <w:rPr>
           <w:rFonts w:ascii="Arial" w:cs="Arial" w:eastAsia="Arial" w:hAnsi="Arial"/>
         </w:rPr>
-        <w:t xml:space="preserve">FYP-S02-JUE-P2.m4a</w:t>
+        <w:t xml:space="preserve">FYP-S02-JUE-VOZ.m4a</w:t>
       </w:r>
     </w:p>
     <w:p>
@@ -1522,7 +1742,7 @@
           <w:sz w:val="18"/>
           <w:szCs w:val="18"/>
         </w:rPr>
-        <w:t xml:space="preserve">🎙️ AUDIO  ·  Cuánto tiempo es  ·  sale el jueves 22 de octubre, 1:00 p. m.</w:t>
+        <w:t xml:space="preserve">🎙️ AUDIO  ·  Una hora que no cobras  ·  sale el jueves 22 de octubre, 1:00 p. m.</w:t>
       </w:r>
     </w:p>
     <w:p>
@@ -1558,7 +1778,24 @@
           <w:sz w:val="28"/>
           <w:szCs w:val="28"/>
         </w:rPr>
-        <w:t xml:space="preserve">«Escribir 'tengo hora a las cuatro' parece poco. Pero hazlo veinte veces al día y se te va una hora entera. Una hora que no cobras.»</w:t>
+        <w:t xml:space="preserve">«Escribir "tengo hora a las cuatro" parece poco. Pero hazlo veinte veces al día y se te va una hora entera. Una hora que no cobras. Los negocios que valoran su tiempo dejan que el cliente vea sus horas y reserve solo. Eso es bookeaa.»</w:t>
+      </w:r>
+    </w:p>
+    <w:p>
+      <w:pPr>
+        <w:keepNext/>
+        <w:spacing w:after="40"/>
+      </w:pPr>
+      <w:r>
+        <w:rPr>
+          <w:rFonts w:ascii="Arial" w:cs="Arial" w:eastAsia="Arial" w:hAnsi="Arial"/>
+          <w:i/>
+          <w:iCs/>
+          <w:color w:val="5B5B57"/>
+          <w:sz w:val="17"/>
+          <w:szCs w:val="17"/>
+        </w:rPr>
+        <w:t xml:space="preserve">Gancho en pantalla: ¿CUÁNTAS VECES AL DÍA ESCRIBES "TENGO HORA A LAS 4"?</w:t>
       </w:r>
     </w:p>
     <w:p>
@@ -1575,7 +1812,7 @@
           <w:sz w:val="17"/>
           <w:szCs w:val="17"/>
         </w:rPr>
-        <w:t xml:space="preserve">Animación: "20 VECES × 3 MIN = 1 HORA."</w:t>
+        <w:t xml:space="preserve">Imagen: Contador que suma minutos hasta llegar a 1 hora.</w:t>
       </w:r>
     </w:p>
     <w:p>
@@ -1601,7 +1838,7 @@
         <w:rPr>
           <w:rFonts w:ascii="Arial" w:cs="Arial" w:eastAsia="Arial" w:hAnsi="Arial"/>
         </w:rPr>
-        <w:t xml:space="preserve">FYP-S02-VIE-P2.m4a</w:t>
+        <w:t xml:space="preserve">FYP-S02-VIE-VOZ.m4a</w:t>
       </w:r>
     </w:p>
     <w:p>
@@ -1616,7 +1853,7 @@
           <w:sz w:val="18"/>
           <w:szCs w:val="18"/>
         </w:rPr>
-        <w:t xml:space="preserve">🎙️ AUDIO  ·  Tu marca  ·  sale el viernes 23 de octubre, 1:00 p. m.</w:t>
+        <w:t xml:space="preserve">🎙️ AUDIO  ·  Que se vea como tu marca  ·  sale el viernes 23 de octubre, 1:00 p. m.</w:t>
       </w:r>
     </w:p>
     <w:p>
@@ -1652,7 +1889,41 @@
           <w:sz w:val="28"/>
           <w:szCs w:val="28"/>
         </w:rPr>
-        <w:t xml:space="preserve">«Tu página de reservas no tiene que verse como la de todos. Eliges el estilo, pones tu nombre y queda como tu marca.»</w:t>
+        <w:t xml:space="preserve">«Tu página de reservas no tiene que verse como la de todos. Los negocios que cuidan su marca la cuidan también al momento de agendar. En bookeaa eliges entre ocho estilos, pones tu nombre y queda como tú.»</w:t>
+      </w:r>
+    </w:p>
+    <w:p>
+      <w:pPr>
+        <w:keepNext/>
+        <w:spacing w:after="40"/>
+      </w:pPr>
+      <w:r>
+        <w:rPr>
+          <w:rFonts w:ascii="Arial" w:cs="Arial" w:eastAsia="Arial" w:hAnsi="Arial"/>
+          <w:i/>
+          <w:iCs/>
+          <w:color w:val="5B5B57"/>
+          <w:sz w:val="17"/>
+          <w:szCs w:val="17"/>
+        </w:rPr>
+        <w:t xml:space="preserve">Gancho en pantalla: TU AGENDA NO TIENE QUE VERSE COMO LA DE TODOS.</w:t>
+      </w:r>
+    </w:p>
+    <w:p>
+      <w:pPr>
+        <w:keepNext/>
+        <w:spacing w:after="60"/>
+      </w:pPr>
+      <w:r>
+        <w:rPr>
+          <w:rFonts w:ascii="Arial" w:cs="Arial" w:eastAsia="Arial" w:hAnsi="Arial"/>
+          <w:i/>
+          <w:iCs/>
+          <w:color w:val="5B5B57"/>
+          <w:sz w:val="17"/>
+          <w:szCs w:val="17"/>
+        </w:rPr>
+        <w:t xml:space="preserve">Imagen: Una página genérica que cambia de estilo varias veces.</w:t>
       </w:r>
     </w:p>
     <w:p>
@@ -1693,7 +1964,7 @@
         <w:rPr>
           <w:rFonts w:ascii="Arial" w:cs="Arial" w:eastAsia="Arial" w:hAnsi="Arial"/>
         </w:rPr>
-        <w:t xml:space="preserve">FYP-S01-LUN-P3.mp4</w:t>
+        <w:t xml:space="preserve">FYP-S01-LUN-CAM.mp4</w:t>
       </w:r>
     </w:p>
     <w:p>
@@ -1708,7 +1979,7 @@
           <w:sz w:val="18"/>
           <w:szCs w:val="18"/>
         </w:rPr>
-        <w:t xml:space="preserve">🎥 VIDEO A CÁMARA  ·  Lo que hice yo  ·  sale el lunes 12 de octubre, 8:30 p. m.</w:t>
+        <w:t xml:space="preserve">🎥 VIDEO A CÁMARA  ·  Cómo dejar de esperar clientes  ·  sale el lunes 12 de octubre, 8:30 p. m.</w:t>
       </w:r>
     </w:p>
     <w:p>
@@ -1744,7 +2015,24 @@
           <w:sz w:val="28"/>
           <w:szCs w:val="28"/>
         </w:rPr>
-        <w:t xml:space="preserve">«Por eso hice bookeaa. Tu cliente reserva solo desde tu link y la cita le queda guardada en su Google Calendar, no en un chat que se pierde. Link en el perfil.»</w:t>
+        <w:t xml:space="preserve">«¿Cansado de esperar clientes que no llegan? Haz esto: que la cita no viva en tu WhatsApp, que viva en el calendario de tu cliente. Con bookeaa reserva solo desde tu link y la cita le queda guardada. Comenta AGENDA y te mando el link.»</w:t>
+      </w:r>
+    </w:p>
+    <w:p>
+      <w:pPr>
+        <w:keepNext/>
+        <w:spacing w:after="40"/>
+      </w:pPr>
+      <w:r>
+        <w:rPr>
+          <w:rFonts w:ascii="Arial" w:cs="Arial" w:eastAsia="Arial" w:hAnsi="Arial"/>
+          <w:i/>
+          <w:iCs/>
+          <w:color w:val="5B5B57"/>
+          <w:sz w:val="17"/>
+          <w:szCs w:val="17"/>
+        </w:rPr>
+        <w:t xml:space="preserve">Gancho en pantalla: ¿CANSADO DE ESPERAR CLIENTES QUE NO LLEGAN?</w:t>
       </w:r>
     </w:p>
     <w:p>
@@ -1761,7 +2049,7 @@
           <w:sz w:val="17"/>
           <w:szCs w:val="17"/>
         </w:rPr>
-        <w:t xml:space="preserve">En pantalla: ASÍ LO RESOLVÍ.   ·   Animación: tú, plano cerca, levantas el teléfono hacia la cámara.</w:t>
+        <w:t xml:space="preserve">Cómo grabarlo: Tú a cámara; entra la tarjeta de Google Calendar.</w:t>
       </w:r>
     </w:p>
     <w:p>
@@ -1787,7 +2075,7 @@
         <w:rPr>
           <w:rFonts w:ascii="Arial" w:cs="Arial" w:eastAsia="Arial" w:hAnsi="Arial"/>
         </w:rPr>
-        <w:t xml:space="preserve">FYP-S01-MAR-P3.mp4</w:t>
+        <w:t xml:space="preserve">FYP-S01-MAR-CAM.mp4</w:t>
       </w:r>
     </w:p>
     <w:p>
@@ -1802,7 +2090,7 @@
           <w:sz w:val="18"/>
           <w:szCs w:val="18"/>
         </w:rPr>
-        <w:t xml:space="preserve">🎥 VIDEO A CÁMARA  ·  Tu opinión  ·  sale el martes 13 de octubre, 8:30 p. m.</w:t>
+        <w:t xml:space="preserve">🎥 VIDEO A CÁMARA  ·  No es contestar más rápido  ·  sale el martes 13 de octubre, 8:30 p. m.</w:t>
       </w:r>
     </w:p>
     <w:p>
@@ -1838,7 +2126,24 @@
           <w:sz w:val="28"/>
           <w:szCs w:val="28"/>
         </w:rPr>
-        <w:t xml:space="preserve">«Y no es tu culpa. Mientras atiendes a uno, no puedes contestarle a otro. La solución no es contestar más rápido: es que tu cliente no tenga que esperarte. Eso hace bookeaa.»</w:t>
+        <w:t xml:space="preserve">«El problema no es que contestes lento. Es que mientras atiendes a uno, no puedes contestarle a otro. La solución no es vivir pegado al teléfono: es que tu cliente no tenga que esperarte. Con bookeaa reserva solo, a cualquier hora. Link en mi perfil.»</w:t>
+      </w:r>
+    </w:p>
+    <w:p>
+      <w:pPr>
+        <w:keepNext/>
+        <w:spacing w:after="40"/>
+      </w:pPr>
+      <w:r>
+        <w:rPr>
+          <w:rFonts w:ascii="Arial" w:cs="Arial" w:eastAsia="Arial" w:hAnsi="Arial"/>
+          <w:i/>
+          <w:iCs/>
+          <w:color w:val="5B5B57"/>
+          <w:sz w:val="17"/>
+          <w:szCs w:val="17"/>
+        </w:rPr>
+        <w:t xml:space="preserve">Gancho en pantalla: EL PROBLEMA NO ES QUE CONTESTES LENTO.</w:t>
       </w:r>
     </w:p>
     <w:p>
@@ -1855,7 +2160,7 @@
           <w:sz w:val="17"/>
           <w:szCs w:val="17"/>
         </w:rPr>
-        <w:t xml:space="preserve">En pantalla: NO ES CONTESTAR MÁS RÁPIDO.</w:t>
+        <w:t xml:space="preserve">Cómo grabarlo: Tú a cámara; texto "NO ES CONTESTAR MÁS RÁPIDO."</w:t>
       </w:r>
     </w:p>
     <w:p>
@@ -1881,7 +2186,7 @@
         <w:rPr>
           <w:rFonts w:ascii="Arial" w:cs="Arial" w:eastAsia="Arial" w:hAnsi="Arial"/>
         </w:rPr>
-        <w:t xml:space="preserve">FYP-S01-MIE-P3.mp4</w:t>
+        <w:t xml:space="preserve">FYP-S01-MIE-CAM.mp4</w:t>
       </w:r>
     </w:p>
     <w:p>
@@ -1896,7 +2201,7 @@
           <w:sz w:val="18"/>
           <w:szCs w:val="18"/>
         </w:rPr>
-        <w:t xml:space="preserve">🎥 VIDEO A CÁMARA  ·  Tu agenda vende  ·  sale el miércoles 14 de octubre, 8:30 p. m.</w:t>
+        <w:t xml:space="preserve">🎥 VIDEO A CÁMARA  ·  Tu agenda también vende  ·  sale el miércoles 14 de octubre, 8:30 p. m.</w:t>
       </w:r>
     </w:p>
     <w:p>
@@ -1932,7 +2237,24 @@
           <w:sz w:val="28"/>
           <w:szCs w:val="28"/>
         </w:rPr>
-        <w:t xml:space="preserve">«La tercera es mi favorita: tu agenda también vende. Cuando tu clienta ve tu página con tus servicios, tus precios y tus horas libres… reserva sola. Te muestro.»</w:t>
+        <w:t xml:space="preserve">«Manicurista, tu agenda también vende. Cuando tu clienta ve tu página con tus servicios, tus precios y tus horas libres, no pregunta: reserva. Eso hace bookeaa. Comenta AGENDA y te mando el link para que lo pruebes gratis.»</w:t>
+      </w:r>
+    </w:p>
+    <w:p>
+      <w:pPr>
+        <w:keepNext/>
+        <w:spacing w:after="40"/>
+      </w:pPr>
+      <w:r>
+        <w:rPr>
+          <w:rFonts w:ascii="Arial" w:cs="Arial" w:eastAsia="Arial" w:hAnsi="Arial"/>
+          <w:i/>
+          <w:iCs/>
+          <w:color w:val="5B5B57"/>
+          <w:sz w:val="17"/>
+          <w:szCs w:val="17"/>
+        </w:rPr>
+        <w:t xml:space="preserve">Gancho en pantalla: MANICURISTA: TU AGENDA TAMBIÉN VENDE.</w:t>
       </w:r>
     </w:p>
     <w:p>
@@ -1949,7 +2271,7 @@
           <w:sz w:val="17"/>
           <w:szCs w:val="17"/>
         </w:rPr>
-        <w:t xml:space="preserve">Animación: teléfono con una página estilo "elegante" entrando de lado.</w:t>
+        <w:t xml:space="preserve">Cómo grabarlo: Tú a cámara; entra de lado un teléfono con una página estilo "elegante".</w:t>
       </w:r>
     </w:p>
     <w:p>
@@ -1975,7 +2297,7 @@
         <w:rPr>
           <w:rFonts w:ascii="Arial" w:cs="Arial" w:eastAsia="Arial" w:hAnsi="Arial"/>
         </w:rPr>
-        <w:t xml:space="preserve">FYP-S01-JUE-P3.mp4</w:t>
+        <w:t xml:space="preserve">FYP-S01-JUE-CAM.mp4</w:t>
       </w:r>
     </w:p>
     <w:p>
@@ -1990,7 +2312,7 @@
           <w:sz w:val="18"/>
           <w:szCs w:val="18"/>
         </w:rPr>
-        <w:t xml:space="preserve">🎥 VIDEO A CÁMARA  ·  Lo que te diría  ·  sale el jueves 15 de octubre, 8:30 p. m.</w:t>
+        <w:t xml:space="preserve">🎥 VIDEO A CÁMARA  ·  Lo que le diría a quien empieza  ·  sale el jueves 15 de octubre, 8:30 p. m.</w:t>
       </w:r>
     </w:p>
     <w:p>
@@ -2026,7 +2348,41 @@
           <w:sz w:val="28"/>
           <w:szCs w:val="28"/>
         </w:rPr>
-        <w:t xml:space="preserve">«Si pudiera decirle algo a cualquiera que empieza un negocio con citas: pon tu agenda donde tus clientes la vean. Con un link. Eso cambia todo.»</w:t>
+        <w:t xml:space="preserve">«Si estás empezando un negocio con citas, te digo lo que yo habría querido saber: pon tu agenda donde tus clientes la vean. En un link. Deja de anotar y empieza a recibir reservas. Por eso hice bookeaa. Sígueme para más.»</w:t>
+      </w:r>
+    </w:p>
+    <w:p>
+      <w:pPr>
+        <w:keepNext/>
+        <w:spacing w:after="40"/>
+      </w:pPr>
+      <w:r>
+        <w:rPr>
+          <w:rFonts w:ascii="Arial" w:cs="Arial" w:eastAsia="Arial" w:hAnsi="Arial"/>
+          <w:i/>
+          <w:iCs/>
+          <w:color w:val="5B5B57"/>
+          <w:sz w:val="17"/>
+          <w:szCs w:val="17"/>
+        </w:rPr>
+        <w:t xml:space="preserve">Gancho en pantalla: SI ESTÁS EMPEZANDO UN NEGOCIO, ESCUCHA ESTO.</w:t>
+      </w:r>
+    </w:p>
+    <w:p>
+      <w:pPr>
+        <w:keepNext/>
+        <w:spacing w:after="60"/>
+      </w:pPr>
+      <w:r>
+        <w:rPr>
+          <w:rFonts w:ascii="Arial" w:cs="Arial" w:eastAsia="Arial" w:hAnsi="Arial"/>
+          <w:i/>
+          <w:iCs/>
+          <w:color w:val="5B5B57"/>
+          <w:sz w:val="17"/>
+          <w:szCs w:val="17"/>
+        </w:rPr>
+        <w:t xml:space="preserve">Cómo grabarlo: Tú a cámara, cercano.</w:t>
       </w:r>
     </w:p>
     <w:p>
@@ -2052,7 +2408,7 @@
         <w:rPr>
           <w:rFonts w:ascii="Arial" w:cs="Arial" w:eastAsia="Arial" w:hAnsi="Arial"/>
         </w:rPr>
-        <w:t xml:space="preserve">FYP-S01-VIE-P3.mp4</w:t>
+        <w:t xml:space="preserve">FYP-S01-VIE-CAM.mp4</w:t>
       </w:r>
     </w:p>
     <w:p>
@@ -2067,7 +2423,7 @@
           <w:sz w:val="18"/>
           <w:szCs w:val="18"/>
         </w:rPr>
-        <w:t xml:space="preserve">🎥 VIDEO A CÁMARA  ·  Semana 1  ·  sale el viernes 16 de octubre, 8:30 p. m.</w:t>
+        <w:t xml:space="preserve">🎥 VIDEO A CÁMARA  ·  Pruébalo gratis  ·  sale el viernes 16 de octubre, 8:30 p. m.</w:t>
       </w:r>
     </w:p>
     <w:p>
@@ -2103,7 +2459,24 @@
           <w:sz w:val="28"/>
           <w:szCs w:val="28"/>
         </w:rPr>
-        <w:t xml:space="preserve">«Primera semana haciendo esto todos los días. Si trabajas con citas, el primer mes de bookeaa es gratis. Comenta AGENDA y te mando el link.»</w:t>
+        <w:t xml:space="preserve">«Si trabajas con citas, barbería, uñas, spa o consultorio, esto es para ti. Con bookeaa tienes tu página de reservas con tu nombre y tus clientes reservan solos. El primer mes es gratis. Comenta AGENDA y te mando el link.»</w:t>
+      </w:r>
+    </w:p>
+    <w:p>
+      <w:pPr>
+        <w:keepNext/>
+        <w:spacing w:after="40"/>
+      </w:pPr>
+      <w:r>
+        <w:rPr>
+          <w:rFonts w:ascii="Arial" w:cs="Arial" w:eastAsia="Arial" w:hAnsi="Arial"/>
+          <w:i/>
+          <w:iCs/>
+          <w:color w:val="5B5B57"/>
+          <w:sz w:val="17"/>
+          <w:szCs w:val="17"/>
+        </w:rPr>
+        <w:t xml:space="preserve">Gancho en pantalla: SI TRABAJAS CON CITAS, ESTO ES PARA TI.</w:t>
       </w:r>
     </w:p>
     <w:p>
@@ -2120,7 +2493,7 @@
           <w:sz w:val="17"/>
           <w:szCs w:val="17"/>
         </w:rPr>
-        <w:t xml:space="preserve">En pantalla: COMENTA 'AGENDA'.</w:t>
+        <w:t xml:space="preserve">Cómo grabarlo: Tú a cámara; texto "COMENTA AGENDA".</w:t>
       </w:r>
     </w:p>
     <w:p>
@@ -2146,7 +2519,7 @@
         <w:rPr>
           <w:rFonts w:ascii="Arial" w:cs="Arial" w:eastAsia="Arial" w:hAnsi="Arial"/>
         </w:rPr>
-        <w:t xml:space="preserve">FYP-S02-LUN-P3.mp4</w:t>
+        <w:t xml:space="preserve">FYP-S02-LUN-CAM.mp4</w:t>
       </w:r>
     </w:p>
     <w:p>
@@ -2161,7 +2534,7 @@
           <w:sz w:val="18"/>
           <w:szCs w:val="18"/>
         </w:rPr>
-        <w:t xml:space="preserve">🎥 VIDEO A CÁMARA  ·  Mi historia  ·  sale el lunes 19 de octubre, 8:30 p. m.</w:t>
+        <w:t xml:space="preserve">🎥 VIDEO A CÁMARA  ·  Me pasó como cliente  ·  sale el lunes 19 de octubre, 8:30 p. m.</w:t>
       </w:r>
     </w:p>
     <w:p>
@@ -2197,7 +2570,41 @@
           <w:sz w:val="28"/>
           <w:szCs w:val="28"/>
         </w:rPr>
-        <w:t xml:space="preserve">«A mí me pasó como cliente. Llegué y había otro esperando para la misma hora. Me fui. Por eso en bookeaa tu cliente solo ve las horas que de verdad tienes libres.»</w:t>
+        <w:t xml:space="preserve">«Una vez llegué a cortarme y había otro esperando para la misma hora. Me fui. Y el barbero ni se enteró de que perdió un cliente. Por eso en bookeaa tu cliente solo ve las horas que de verdad tienes libres. Link en mi perfil.»</w:t>
+      </w:r>
+    </w:p>
+    <w:p>
+      <w:pPr>
+        <w:keepNext/>
+        <w:spacing w:after="40"/>
+      </w:pPr>
+      <w:r>
+        <w:rPr>
+          <w:rFonts w:ascii="Arial" w:cs="Arial" w:eastAsia="Arial" w:hAnsi="Arial"/>
+          <w:i/>
+          <w:iCs/>
+          <w:color w:val="5B5B57"/>
+          <w:sz w:val="17"/>
+          <w:szCs w:val="17"/>
+        </w:rPr>
+        <w:t xml:space="preserve">Gancho en pantalla: ME PASÓ Y ME FUI.</w:t>
+      </w:r>
+    </w:p>
+    <w:p>
+      <w:pPr>
+        <w:keepNext/>
+        <w:spacing w:after="60"/>
+      </w:pPr>
+      <w:r>
+        <w:rPr>
+          <w:rFonts w:ascii="Arial" w:cs="Arial" w:eastAsia="Arial" w:hAnsi="Arial"/>
+          <w:i/>
+          <w:iCs/>
+          <w:color w:val="5B5B57"/>
+          <w:sz w:val="17"/>
+          <w:szCs w:val="17"/>
+        </w:rPr>
+        <w:t xml:space="preserve">Cómo grabarlo: Tú a cámara contando la historia.</w:t>
       </w:r>
     </w:p>
     <w:p>
@@ -2223,7 +2630,7 @@
         <w:rPr>
           <w:rFonts w:ascii="Arial" w:cs="Arial" w:eastAsia="Arial" w:hAnsi="Arial"/>
         </w:rPr>
-        <w:t xml:space="preserve">FYP-S02-MAR-P3.mp4</w:t>
+        <w:t xml:space="preserve">FYP-S02-MAR-CAM.mp4</w:t>
       </w:r>
     </w:p>
     <w:p>
@@ -2238,7 +2645,7 @@
           <w:sz w:val="18"/>
           <w:szCs w:val="18"/>
         </w:rPr>
-        <w:t xml:space="preserve">🎥 VIDEO A CÁMARA  ·  Muéstralo  ·  sale el martes 20 de octubre, 8:30 p. m.</w:t>
+        <w:t xml:space="preserve">🎥 VIDEO A CÁMARA  ·  Muestra tus precios  ·  sale el martes 20 de octubre, 8:30 p. m.</w:t>
       </w:r>
     </w:p>
     <w:p>
@@ -2274,7 +2681,24 @@
           <w:sz w:val="28"/>
           <w:szCs w:val="28"/>
         </w:rPr>
-        <w:t xml:space="preserve">«En bookeaa pones tus servicios con precio y duración. Tu cliente ve todo, elige y reserva. Sin preguntas incómodas.»</w:t>
+        <w:t xml:space="preserve">«Muestra tus precios. El cliente que sabe cuánto va a pagar, reserva más rápido y llega seguro. En bookeaa pones cada servicio con su precio y su duración, y tu cliente reserva solo. Comenta AGENDA y te paso el link.»</w:t>
+      </w:r>
+    </w:p>
+    <w:p>
+      <w:pPr>
+        <w:keepNext/>
+        <w:spacing w:after="40"/>
+      </w:pPr>
+      <w:r>
+        <w:rPr>
+          <w:rFonts w:ascii="Arial" w:cs="Arial" w:eastAsia="Arial" w:hAnsi="Arial"/>
+          <w:i/>
+          <w:iCs/>
+          <w:color w:val="5B5B57"/>
+          <w:sz w:val="17"/>
+          <w:szCs w:val="17"/>
+        </w:rPr>
+        <w:t xml:space="preserve">Gancho en pantalla: MUESTRA TUS PRECIOS. TE EXPLICO POR QUÉ.</w:t>
       </w:r>
     </w:p>
     <w:p>
@@ -2291,7 +2715,7 @@
           <w:sz w:val="17"/>
           <w:szCs w:val="17"/>
         </w:rPr>
-        <w:t xml:space="preserve">Animación: teléfono con la pantalla de servicios.</w:t>
+        <w:t xml:space="preserve">Cómo grabarlo: Tú a cámara; entra el teléfono con la pantalla de servicios.</w:t>
       </w:r>
     </w:p>
     <w:p>
@@ -2317,7 +2741,7 @@
         <w:rPr>
           <w:rFonts w:ascii="Arial" w:cs="Arial" w:eastAsia="Arial" w:hAnsi="Arial"/>
         </w:rPr>
-        <w:t xml:space="preserve">FYP-S02-MIE-P3.mp4</w:t>
+        <w:t xml:space="preserve">FYP-S02-MIE-CAM.mp4</w:t>
       </w:r>
     </w:p>
     <w:p>
@@ -2332,7 +2756,7 @@
           <w:sz w:val="18"/>
           <w:szCs w:val="18"/>
         </w:rPr>
-        <w:t xml:space="preserve">🎥 VIDEO A CÁMARA  ·  Tu link  ·  sale el miércoles 21 de octubre, 8:30 p. m.</w:t>
+        <w:t xml:space="preserve">🎥 VIDEO A CÁMARA  ·  Dónde poner tu link  ·  sale el miércoles 21 de octubre, 8:30 p. m.</w:t>
       </w:r>
     </w:p>
     <w:p>
@@ -2368,7 +2792,24 @@
           <w:sz w:val="28"/>
           <w:szCs w:val="28"/>
         </w:rPr>
-        <w:t xml:space="preserve">«Ponlo en tu bio de Instagram, en tu estado de WhatsApp y en un QR en el espejo de la barbería. Tu link trabaja aunque tú estés cortando.»</w:t>
+        <w:t xml:space="preserve">«Barbero, pon tu link de reservas en tres lugares: tu bio de Instagram, tu estado de WhatsApp y un código QR en el espejo. Tu link trabaja mientras tú cortas. Con bookeaa lo tienes listo en minutos. Link en mi perfil.»</w:t>
+      </w:r>
+    </w:p>
+    <w:p>
+      <w:pPr>
+        <w:keepNext/>
+        <w:spacing w:after="40"/>
+      </w:pPr>
+      <w:r>
+        <w:rPr>
+          <w:rFonts w:ascii="Arial" w:cs="Arial" w:eastAsia="Arial" w:hAnsi="Arial"/>
+          <w:i/>
+          <w:iCs/>
+          <w:color w:val="5B5B57"/>
+          <w:sz w:val="17"/>
+          <w:szCs w:val="17"/>
+        </w:rPr>
+        <w:t xml:space="preserve">Gancho en pantalla: BARBERO: PON TU LINK EN ESTOS 3 LUGARES.</w:t>
       </w:r>
     </w:p>
     <w:p>
@@ -2385,7 +2826,7 @@
           <w:sz w:val="17"/>
           <w:szCs w:val="17"/>
         </w:rPr>
-        <w:t xml:space="preserve">Animación: QR apareciendo.</w:t>
+        <w:t xml:space="preserve">Cómo grabarlo: Tú a cámara; aparecen bio, estado de WhatsApp y un código QR.</w:t>
       </w:r>
     </w:p>
     <w:p>
@@ -2411,7 +2852,7 @@
         <w:rPr>
           <w:rFonts w:ascii="Arial" w:cs="Arial" w:eastAsia="Arial" w:hAnsi="Arial"/>
         </w:rPr>
-        <w:t xml:space="preserve">FYP-S02-JUE-P3.mp4</w:t>
+        <w:t xml:space="preserve">FYP-S02-JUE-CAM.mp4</w:t>
       </w:r>
     </w:p>
     <w:p>
@@ -2426,7 +2867,7 @@
           <w:sz w:val="18"/>
           <w:szCs w:val="18"/>
         </w:rPr>
-        <w:t xml:space="preserve">🎥 VIDEO A CÁMARA  ·  Qué haría  ·  sale el jueves 22 de octubre, 8:30 p. m.</w:t>
+        <w:t xml:space="preserve">🎥 VIDEO A CÁMARA  ·  Lo primero que haría  ·  sale el jueves 22 de octubre, 8:30 p. m.</w:t>
       </w:r>
     </w:p>
     <w:p>
@@ -2462,7 +2903,41 @@
           <w:sz w:val="28"/>
           <w:szCs w:val="28"/>
         </w:rPr>
-        <w:t xml:space="preserve">«Si empezara hoy, lo primero que haría es dejar de agendar a mano. No porque sea flojo… sino porque ese tiempo vale plata.»</w:t>
+        <w:t xml:space="preserve">«Si empezara mi negocio hoy, lo primero que haría es dejar de agendar a mano. No por flojo, sino porque ese tiempo vale plata. Pon tu agenda en un link y dedícate a atender. Sígueme, que todos los días te doy un tip.»</w:t>
+      </w:r>
+    </w:p>
+    <w:p>
+      <w:pPr>
+        <w:keepNext/>
+        <w:spacing w:after="40"/>
+      </w:pPr>
+      <w:r>
+        <w:rPr>
+          <w:rFonts w:ascii="Arial" w:cs="Arial" w:eastAsia="Arial" w:hAnsi="Arial"/>
+          <w:i/>
+          <w:iCs/>
+          <w:color w:val="5B5B57"/>
+          <w:sz w:val="17"/>
+          <w:szCs w:val="17"/>
+        </w:rPr>
+        <w:t xml:space="preserve">Gancho en pantalla: SI EMPEZARA MI NEGOCIO HOY, HARÍA ESTO PRIMERO.</w:t>
+      </w:r>
+    </w:p>
+    <w:p>
+      <w:pPr>
+        <w:keepNext/>
+        <w:spacing w:after="60"/>
+      </w:pPr>
+      <w:r>
+        <w:rPr>
+          <w:rFonts w:ascii="Arial" w:cs="Arial" w:eastAsia="Arial" w:hAnsi="Arial"/>
+          <w:i/>
+          <w:iCs/>
+          <w:color w:val="5B5B57"/>
+          <w:sz w:val="17"/>
+          <w:szCs w:val="17"/>
+        </w:rPr>
+        <w:t xml:space="preserve">Cómo grabarlo: Tú a cámara.</w:t>
       </w:r>
     </w:p>
     <w:p>
@@ -2488,7 +2963,7 @@
         <w:rPr>
           <w:rFonts w:ascii="Arial" w:cs="Arial" w:eastAsia="Arial" w:hAnsi="Arial"/>
         </w:rPr>
-        <w:t xml:space="preserve">FYP-S02-VIE-P3.mp4</w:t>
+        <w:t xml:space="preserve">FYP-S02-VIE-CAM.mp4</w:t>
       </w:r>
     </w:p>
     <w:p>
@@ -2503,7 +2978,7 @@
           <w:sz w:val="18"/>
           <w:szCs w:val="18"/>
         </w:rPr>
-        <w:t xml:space="preserve">🎥 VIDEO A CÁMARA  ·  Elige  ·  sale el viernes 23 de octubre, 8:30 p. m.</w:t>
+        <w:t xml:space="preserve">🎥 VIDEO A CÁMARA  ·  Elige tu estilo  ·  sale el viernes 23 de octubre, 8:30 p. m.</w:t>
       </w:r>
     </w:p>
     <w:p>
@@ -2539,7 +3014,24 @@
           <w:sz w:val="28"/>
           <w:szCs w:val="28"/>
         </w:rPr>
-        <w:t xml:space="preserve">«Comenta el número del estilo que te gustó y te armo tu página de prueba. El primer mes es gratis.»</w:t>
+        <w:t xml:space="preserve">«Si tuvieras que elegir un estilo para tu página de reservas, ¿cuál sería? Comenta el número del uno al ocho. En bookeaa los tienes todos y el primer mes es gratis.»</w:t>
+      </w:r>
+    </w:p>
+    <w:p>
+      <w:pPr>
+        <w:keepNext/>
+        <w:spacing w:after="40"/>
+      </w:pPr>
+      <w:r>
+        <w:rPr>
+          <w:rFonts w:ascii="Arial" w:cs="Arial" w:eastAsia="Arial" w:hAnsi="Arial"/>
+          <w:i/>
+          <w:iCs/>
+          <w:color w:val="5B5B57"/>
+          <w:sz w:val="17"/>
+          <w:szCs w:val="17"/>
+        </w:rPr>
+        <w:t xml:space="preserve">Gancho en pantalla: ¿CUÁL ELEGIRÍAS PARA TU NEGOCIO?</w:t>
       </w:r>
     </w:p>
     <w:p>
@@ -2556,7 +3048,7 @@
           <w:sz w:val="17"/>
           <w:szCs w:val="17"/>
         </w:rPr>
-        <w:t xml:space="preserve">En pantalla: COMENTA 1–8.</w:t>
+        <w:t xml:space="preserve">Cómo grabarlo: Tú a cámara; los 8 estilos detrás de ti.</w:t>
       </w:r>
     </w:p>
     <w:p>
@@ -2599,7 +3091,7 @@
           <w:sz w:val="21"/>
           <w:szCs w:val="21"/>
         </w:rPr>
-        <w:t xml:space="preserve">Semana 3: del 26 al 30 de octubre. Pásamelo antes del domingo 25 en la noche. (Si quieres, grábala junto con la sesión 2.)</w:t>
+        <w:t xml:space="preserve">Semana 3: del 26 al 30 de octubre. Pásamelo antes del domingo 25 en la noche (o grábala junto con la sesión 2).</w:t>
       </w:r>
     </w:p>
     <w:p>
@@ -2627,7 +3119,7 @@
         <w:rPr>
           <w:rFonts w:ascii="Arial" w:cs="Arial" w:eastAsia="Arial" w:hAnsi="Arial"/>
         </w:rPr>
-        <w:t xml:space="preserve">FYP-S03-LUN-P2.m4a</w:t>
+        <w:t xml:space="preserve">FYP-S03-LUN-VOZ.m4a</w:t>
       </w:r>
     </w:p>
     <w:p>
@@ -2678,7 +3170,24 @@
           <w:sz w:val="28"/>
           <w:szCs w:val="28"/>
         </w:rPr>
-        <w:t xml:space="preserve">«Cuando te cancelan, esa hora queda libre en tu página al instante. Y alguien que estaba mirando tus horarios la puede tomar sin escribirte.»</w:t>
+        <w:t xml:space="preserve">«Cuando te cancelan, esa hora no tiene que perderse. Si tus horarios están en un link, la hora libre se ve al instante y alguien que estaba mirando la puede tomar sin escribirte. Así trabajan los negocios organizados, con bookeaa.»</w:t>
+      </w:r>
+    </w:p>
+    <w:p>
+      <w:pPr>
+        <w:keepNext/>
+        <w:spacing w:after="40"/>
+      </w:pPr>
+      <w:r>
+        <w:rPr>
+          <w:rFonts w:ascii="Arial" w:cs="Arial" w:eastAsia="Arial" w:hAnsi="Arial"/>
+          <w:i/>
+          <w:iCs/>
+          <w:color w:val="5B5B57"/>
+          <w:sz w:val="17"/>
+          <w:szCs w:val="17"/>
+        </w:rPr>
+        <w:t xml:space="preserve">Gancho en pantalla: UNA CANCELACIÓN NO TIENE QUE SER UNA HORA PERDIDA.</w:t>
       </w:r>
     </w:p>
     <w:p>
@@ -2695,7 +3204,7 @@
           <w:sz w:val="17"/>
           <w:szCs w:val="17"/>
         </w:rPr>
-        <w:t xml:space="preserve">Animación: la hora libre aparece en el calendario y se llena con "Nueva reserva".</w:t>
+        <w:t xml:space="preserve">Imagen: La hora libre aparece en el calendario y se llena con "Nueva reserva".</w:t>
       </w:r>
     </w:p>
     <w:p>
@@ -2721,7 +3230,7 @@
         <w:rPr>
           <w:rFonts w:ascii="Arial" w:cs="Arial" w:eastAsia="Arial" w:hAnsi="Arial"/>
         </w:rPr>
-        <w:t xml:space="preserve">FYP-S03-MAR-P2.m4a</w:t>
+        <w:t xml:space="preserve">FYP-S03-MAR-VOZ.m4a</w:t>
       </w:r>
     </w:p>
     <w:p>
@@ -2736,7 +3245,7 @@
           <w:sz w:val="18"/>
           <w:szCs w:val="18"/>
         </w:rPr>
-        <w:t xml:space="preserve">🎙️ AUDIO  ·  Por qué hay huecos  ·  sale el martes 27 de octubre, 1:00 p. m.</w:t>
+        <w:t xml:space="preserve">🎙️ AUDIO  ·  Si lo ven, lo toman  ·  sale el martes 27 de octubre, 1:00 p. m.</w:t>
       </w:r>
     </w:p>
     <w:p>
@@ -2772,7 +3281,24 @@
           <w:sz w:val="28"/>
           <w:szCs w:val="28"/>
         </w:rPr>
-        <w:t xml:space="preserve">«Los huecos en tu agenda no son porque no haya clientes. Son porque tus clientes no saben que tienes ese espacio. Si lo ven, lo toman.»</w:t>
+        <w:t xml:space="preserve">«Los huecos en tu agenda no son porque falten clientes. Son porque tus clientes no saben que tienes ese espacio. Si lo ven, lo toman. Con bookeaa tus horas libres están a la vista en tu link, todo el día.»</w:t>
+      </w:r>
+    </w:p>
+    <w:p>
+      <w:pPr>
+        <w:keepNext/>
+        <w:spacing w:after="40"/>
+      </w:pPr>
+      <w:r>
+        <w:rPr>
+          <w:rFonts w:ascii="Arial" w:cs="Arial" w:eastAsia="Arial" w:hAnsi="Arial"/>
+          <w:i/>
+          <w:iCs/>
+          <w:color w:val="5B5B57"/>
+          <w:sz w:val="17"/>
+          <w:szCs w:val="17"/>
+        </w:rPr>
+        <w:t xml:space="preserve">Gancho en pantalla: LOS HUECOS EN TU AGENDA TIENEN UNA RAZÓN.</w:t>
       </w:r>
     </w:p>
     <w:p>
@@ -2789,7 +3315,7 @@
           <w:sz w:val="17"/>
           <w:szCs w:val="17"/>
         </w:rPr>
-        <w:t xml:space="preserve">En pantalla: SI LO VEN, LO TOMAN.</w:t>
+        <w:t xml:space="preserve">Imagen: Huecos del calendario que se llenan uno por uno.</w:t>
       </w:r>
     </w:p>
     <w:p>
@@ -2815,7 +3341,7 @@
         <w:rPr>
           <w:rFonts w:ascii="Arial" w:cs="Arial" w:eastAsia="Arial" w:hAnsi="Arial"/>
         </w:rPr>
-        <w:t xml:space="preserve">FYP-S03-MIE-P2.m4a</w:t>
+        <w:t xml:space="preserve">FYP-S03-MIE-VOZ.m4a</w:t>
       </w:r>
     </w:p>
     <w:p>
@@ -2866,7 +3392,41 @@
           <w:sz w:val="28"/>
           <w:szCs w:val="28"/>
         </w:rPr>
-        <w:t xml:space="preserve">«Tu clienta busca relajarse. Si para reservar tiene que esperar respuestas por WhatsApp, la experiencia ya empezó mal. Una página bonita y fácil es parte del servicio.»</w:t>
+        <w:t xml:space="preserve">«Tu clienta busca relajarse. Si para reservar tiene que esperar respuestas por WhatsApp, la experiencia ya empezó mal. Los spas que cuidan cada detalle tienen una página bonita y fácil para reservar. Con bookeaa la tienes.»</w:t>
+      </w:r>
+    </w:p>
+    <w:p>
+      <w:pPr>
+        <w:keepNext/>
+        <w:spacing w:after="40"/>
+      </w:pPr>
+      <w:r>
+        <w:rPr>
+          <w:rFonts w:ascii="Arial" w:cs="Arial" w:eastAsia="Arial" w:hAnsi="Arial"/>
+          <w:i/>
+          <w:iCs/>
+          <w:color w:val="5B5B57"/>
+          <w:sz w:val="17"/>
+          <w:szCs w:val="17"/>
+        </w:rPr>
+        <w:t xml:space="preserve">Gancho en pantalla: SI TIENES UN SPA, TU EXPERIENCIA EMPIEZA ANTES DE LO QUE CREES.</w:t>
+      </w:r>
+    </w:p>
+    <w:p>
+      <w:pPr>
+        <w:keepNext/>
+        <w:spacing w:after="60"/>
+      </w:pPr>
+      <w:r>
+        <w:rPr>
+          <w:rFonts w:ascii="Arial" w:cs="Arial" w:eastAsia="Arial" w:hAnsi="Arial"/>
+          <w:i/>
+          <w:iCs/>
+          <w:color w:val="5B5B57"/>
+          <w:sz w:val="17"/>
+          <w:szCs w:val="17"/>
+        </w:rPr>
+        <w:t xml:space="preserve">Imagen: Una clienta relajada que se estresa esperando respuesta… y luego reserva en un link.</w:t>
       </w:r>
     </w:p>
     <w:p>
@@ -2892,7 +3452,7 @@
         <w:rPr>
           <w:rFonts w:ascii="Arial" w:cs="Arial" w:eastAsia="Arial" w:hAnsi="Arial"/>
         </w:rPr>
-        <w:t xml:space="preserve">FYP-S03-JUE-P2.m4a</w:t>
+        <w:t xml:space="preserve">FYP-S03-JUE-VOZ.m4a</w:t>
       </w:r>
     </w:p>
     <w:p>
@@ -2907,7 +3467,7 @@
           <w:sz w:val="18"/>
           <w:szCs w:val="18"/>
         </w:rPr>
-        <w:t xml:space="preserve">🎙️ AUDIO  ·  Tu descanso  ·  sale el jueves 29 de octubre, 1:00 p. m.</w:t>
+        <w:t xml:space="preserve">🎙️ AUDIO  ·  Tu descanso también cuenta  ·  sale el jueves 29 de octubre, 1:00 p. m.</w:t>
       </w:r>
     </w:p>
     <w:p>
@@ -2943,7 +3503,24 @@
           <w:sz w:val="28"/>
           <w:szCs w:val="28"/>
         </w:rPr>
-        <w:t xml:space="preserve">«Cuando tu número es tu agenda, nunca descansas. Te escriben de noche, en domingo, en tus vacaciones. Con un link, tus clientes reservan y tú desconectas.»</w:t>
+        <w:t xml:space="preserve">«Cuando tu número es tu agenda, nunca descansas: te escriben de noche, en domingo, en tus vacaciones. Los negocios que saben organizar su tiempo usan un link para agendar y el WhatsApp solo para atender. Eso es bookeaa.»</w:t>
+      </w:r>
+    </w:p>
+    <w:p>
+      <w:pPr>
+        <w:keepNext/>
+        <w:spacing w:after="40"/>
+      </w:pPr>
+      <w:r>
+        <w:rPr>
+          <w:rFonts w:ascii="Arial" w:cs="Arial" w:eastAsia="Arial" w:hAnsi="Arial"/>
+          <w:i/>
+          <w:iCs/>
+          <w:color w:val="5B5B57"/>
+          <w:sz w:val="17"/>
+          <w:szCs w:val="17"/>
+        </w:rPr>
+        <w:t xml:space="preserve">Gancho en pantalla: ¿TE ESCRIBEN PARA AGENDAR HASTA EN VACACIONES?</w:t>
       </w:r>
     </w:p>
     <w:p>
@@ -2960,7 +3537,7 @@
           <w:sz w:val="17"/>
           <w:szCs w:val="17"/>
         </w:rPr>
-        <w:t xml:space="preserve">En pantalla: TU LINK TRABAJA. TÚ DESCANSAS.</w:t>
+        <w:t xml:space="preserve">Imagen: Un teléfono en la playa que no para de sonar.</w:t>
       </w:r>
     </w:p>
     <w:p>
@@ -2986,7 +3563,7 @@
         <w:rPr>
           <w:rFonts w:ascii="Arial" w:cs="Arial" w:eastAsia="Arial" w:hAnsi="Arial"/>
         </w:rPr>
-        <w:t xml:space="preserve">FYP-S03-VIE-P2.m4a</w:t>
+        <w:t xml:space="preserve">FYP-S03-VIE-VOZ.m4a</w:t>
       </w:r>
     </w:p>
     <w:p>
@@ -3001,7 +3578,7 @@
           <w:sz w:val="18"/>
           <w:szCs w:val="18"/>
         </w:rPr>
-        <w:t xml:space="preserve">🎙️ AUDIO  ·  Un solo link  ·  sale el viernes 30 de octubre, 1:00 p. m.</w:t>
+        <w:t xml:space="preserve">🎙️ AUDIO  ·  Un solo link para todo  ·  sale el viernes 30 de octubre, 1:00 p. m.</w:t>
       </w:r>
     </w:p>
     <w:p>
@@ -3037,7 +3614,41 @@
           <w:sz w:val="28"/>
           <w:szCs w:val="28"/>
         </w:rPr>
-        <w:t xml:space="preserve">«Si tienes dos sedes o vas a domicilio, igual es un solo link. Tu cliente elige dónde y cuándo, y tú lo ves todo en un mismo calendario.»</w:t>
+        <w:t xml:space="preserve">«Si tienes dos sedes o vas a domicilio, no necesitas dos agendas. Con bookeaa es un solo link: tu cliente elige dónde y cuándo, y tú lo ves todo en un mismo calendario. Así se organiza un negocio que está creciendo.»</w:t>
+      </w:r>
+    </w:p>
+    <w:p>
+      <w:pPr>
+        <w:keepNext/>
+        <w:spacing w:after="40"/>
+      </w:pPr>
+      <w:r>
+        <w:rPr>
+          <w:rFonts w:ascii="Arial" w:cs="Arial" w:eastAsia="Arial" w:hAnsi="Arial"/>
+          <w:i/>
+          <w:iCs/>
+          <w:color w:val="5B5B57"/>
+          <w:sz w:val="17"/>
+          <w:szCs w:val="17"/>
+        </w:rPr>
+        <w:t xml:space="preserve">Gancho en pantalla: UN SOLO LINK. TODAS TUS SEDES.</w:t>
+      </w:r>
+    </w:p>
+    <w:p>
+      <w:pPr>
+        <w:keepNext/>
+        <w:spacing w:after="60"/>
+      </w:pPr>
+      <w:r>
+        <w:rPr>
+          <w:rFonts w:ascii="Arial" w:cs="Arial" w:eastAsia="Arial" w:hAnsi="Arial"/>
+          <w:i/>
+          <w:iCs/>
+          <w:color w:val="5B5B57"/>
+          <w:sz w:val="17"/>
+          <w:szCs w:val="17"/>
+        </w:rPr>
+        <w:t xml:space="preserve">Imagen: Dos sedes que se unen en un mismo calendario.</w:t>
       </w:r>
     </w:p>
     <w:p>
@@ -3078,7 +3689,7 @@
         <w:rPr>
           <w:rFonts w:ascii="Arial" w:cs="Arial" w:eastAsia="Arial" w:hAnsi="Arial"/>
         </w:rPr>
-        <w:t xml:space="preserve">FYP-S03-LUN-P3.mp4</w:t>
+        <w:t xml:space="preserve">FYP-S03-LUN-CAM.mp4</w:t>
       </w:r>
     </w:p>
     <w:p>
@@ -3129,7 +3740,41 @@
           <w:sz w:val="28"/>
           <w:szCs w:val="28"/>
         </w:rPr>
-        <w:t xml:space="preserve">«Imagínate esto: te cancelan a las tres, y a las tres y diez alguien ya reservó esa hora desde tu link, sin escribirte. Una hora libre que se llena sola es plata que no perdiste.»</w:t>
+        <w:t xml:space="preserve">«Imagínate esto: te cancelan a las tres y a las tres y diez alguien ya reservó esa hora desde tu link, sin escribirte. Una hora libre que se llena sola es plata que no perdiste. Eso es bookeaa. Comenta AGENDA.»</w:t>
+      </w:r>
+    </w:p>
+    <w:p>
+      <w:pPr>
+        <w:keepNext/>
+        <w:spacing w:after="40"/>
+      </w:pPr>
+      <w:r>
+        <w:rPr>
+          <w:rFonts w:ascii="Arial" w:cs="Arial" w:eastAsia="Arial" w:hAnsi="Arial"/>
+          <w:i/>
+          <w:iCs/>
+          <w:color w:val="5B5B57"/>
+          <w:sz w:val="17"/>
+          <w:szCs w:val="17"/>
+        </w:rPr>
+        <w:t xml:space="preserve">Gancho en pantalla: IMAGÍNATE ESTO.</w:t>
+      </w:r>
+    </w:p>
+    <w:p>
+      <w:pPr>
+        <w:keepNext/>
+        <w:spacing w:after="60"/>
+      </w:pPr>
+      <w:r>
+        <w:rPr>
+          <w:rFonts w:ascii="Arial" w:cs="Arial" w:eastAsia="Arial" w:hAnsi="Arial"/>
+          <w:i/>
+          <w:iCs/>
+          <w:color w:val="5B5B57"/>
+          <w:sz w:val="17"/>
+          <w:szCs w:val="17"/>
+        </w:rPr>
+        <w:t xml:space="preserve">Cómo grabarlo: Tú a cámara; reloj de 3:00 a 3:10 y una notificación de reserva.</w:t>
       </w:r>
     </w:p>
     <w:p>
@@ -3155,7 +3800,7 @@
         <w:rPr>
           <w:rFonts w:ascii="Arial" w:cs="Arial" w:eastAsia="Arial" w:hAnsi="Arial"/>
         </w:rPr>
-        <w:t xml:space="preserve">FYP-S03-MAR-P3.mp4</w:t>
+        <w:t xml:space="preserve">FYP-S03-MAR-CAM.mp4</w:t>
       </w:r>
     </w:p>
     <w:p>
@@ -3206,7 +3851,41 @@
           <w:sz w:val="28"/>
           <w:szCs w:val="28"/>
         </w:rPr>
-        <w:t xml:space="preserve">«Con bookeaa tus horas libres se ven en tu link en tiempo real. El martes a las tres que nadie te pedía, ahora alguien lo ve y lo reserva.»</w:t>
+        <w:t xml:space="preserve">«Ese martes a las tres que nadie te pide no es mala suerte: nadie sabe que está libre. Pon tus horas a la vista y alguien lo va a tomar. Con bookeaa se ven en tiempo real. Link en mi perfil, el primer mes es gratis.»</w:t>
+      </w:r>
+    </w:p>
+    <w:p>
+      <w:pPr>
+        <w:keepNext/>
+        <w:spacing w:after="40"/>
+      </w:pPr>
+      <w:r>
+        <w:rPr>
+          <w:rFonts w:ascii="Arial" w:cs="Arial" w:eastAsia="Arial" w:hAnsi="Arial"/>
+          <w:i/>
+          <w:iCs/>
+          <w:color w:val="5B5B57"/>
+          <w:sz w:val="17"/>
+          <w:szCs w:val="17"/>
+        </w:rPr>
+        <w:t xml:space="preserve">Gancho en pantalla: ESE MARTES A LAS 3 QUE NADIE TE PIDE…</w:t>
+      </w:r>
+    </w:p>
+    <w:p>
+      <w:pPr>
+        <w:keepNext/>
+        <w:spacing w:after="60"/>
+      </w:pPr>
+      <w:r>
+        <w:rPr>
+          <w:rFonts w:ascii="Arial" w:cs="Arial" w:eastAsia="Arial" w:hAnsi="Arial"/>
+          <w:i/>
+          <w:iCs/>
+          <w:color w:val="5B5B57"/>
+          <w:sz w:val="17"/>
+          <w:szCs w:val="17"/>
+        </w:rPr>
+        <w:t xml:space="preserve">Cómo grabarlo: Tú a cámara.</w:t>
       </w:r>
     </w:p>
     <w:p>
@@ -3232,7 +3911,7 @@
         <w:rPr>
           <w:rFonts w:ascii="Arial" w:cs="Arial" w:eastAsia="Arial" w:hAnsi="Arial"/>
         </w:rPr>
-        <w:t xml:space="preserve">FYP-S03-MIE-P3.mp4</w:t>
+        <w:t xml:space="preserve">FYP-S03-MIE-CAM.mp4</w:t>
       </w:r>
     </w:p>
     <w:p>
@@ -3247,7 +3926,7 @@
           <w:sz w:val="18"/>
           <w:szCs w:val="18"/>
         </w:rPr>
-        <w:t xml:space="preserve">🎥 VIDEO A CÁMARA  ·  Duración  ·  sale el miércoles 28 de octubre, 8:30 p. m.</w:t>
+        <w:t xml:space="preserve">🎥 VIDEO A CÁMARA  ·  Cada servicio, su tiempo  ·  sale el miércoles 28 de octubre, 8:30 p. m.</w:t>
       </w:r>
     </w:p>
     <w:p>
@@ -3283,7 +3962,24 @@
           <w:sz w:val="28"/>
           <w:szCs w:val="28"/>
         </w:rPr>
-        <w:t xml:space="preserve">«En bookeaa cada servicio tiene su duración: un masaje de una hora, un facial de cuarenta y cinco minutos. La agenda se arma sola, sin que se te crucen.»</w:t>
+        <w:t xml:space="preserve">«En un spa cada servicio dura distinto: un masaje una hora, un facial cuarenta y cinco minutos. En bookeaa cada servicio tiene su duración y la agenda se arma sola, sin cruces. Comenta AGENDA y te mando el link.»</w:t>
+      </w:r>
+    </w:p>
+    <w:p>
+      <w:pPr>
+        <w:keepNext/>
+        <w:spacing w:after="40"/>
+      </w:pPr>
+      <w:r>
+        <w:rPr>
+          <w:rFonts w:ascii="Arial" w:cs="Arial" w:eastAsia="Arial" w:hAnsi="Arial"/>
+          <w:i/>
+          <w:iCs/>
+          <w:color w:val="5B5B57"/>
+          <w:sz w:val="17"/>
+          <w:szCs w:val="17"/>
+        </w:rPr>
+        <w:t xml:space="preserve">Gancho en pantalla: SPA: ASÍ NO SE TE CRUZA NI UNA CITA.</w:t>
       </w:r>
     </w:p>
     <w:p>
@@ -3300,7 +3996,7 @@
           <w:sz w:val="17"/>
           <w:szCs w:val="17"/>
         </w:rPr>
-        <w:t xml:space="preserve">Animación: teléfono con servicios y duraciones.</w:t>
+        <w:t xml:space="preserve">Cómo grabarlo: Tú a cámara; teléfono con servicios y duraciones.</w:t>
       </w:r>
     </w:p>
     <w:p>
@@ -3326,7 +4022,7 @@
         <w:rPr>
           <w:rFonts w:ascii="Arial" w:cs="Arial" w:eastAsia="Arial" w:hAnsi="Arial"/>
         </w:rPr>
-        <w:t xml:space="preserve">FYP-S03-JUE-P3.mp4</w:t>
+        <w:t xml:space="preserve">FYP-S03-JUE-CAM.mp4</w:t>
       </w:r>
     </w:p>
     <w:p>
@@ -3377,7 +4073,41 @@
           <w:sz w:val="28"/>
           <w:szCs w:val="28"/>
         </w:rPr>
-        <w:t xml:space="preserve">«Mi regla para cualquier emprendedor: tu WhatsApp es para atender, no para agendar. Para agendar, un link.»</w:t>
+        <w:t xml:space="preserve">«Mi regla para cualquier emprendedor con citas: el WhatsApp es para atender, no para agendar. Para agendar, un link. Así recuperas tus noches y tus domingos. Sígueme, que todos los días te doy un tip como este.»</w:t>
+      </w:r>
+    </w:p>
+    <w:p>
+      <w:pPr>
+        <w:keepNext/>
+        <w:spacing w:after="40"/>
+      </w:pPr>
+      <w:r>
+        <w:rPr>
+          <w:rFonts w:ascii="Arial" w:cs="Arial" w:eastAsia="Arial" w:hAnsi="Arial"/>
+          <w:i/>
+          <w:iCs/>
+          <w:color w:val="5B5B57"/>
+          <w:sz w:val="17"/>
+          <w:szCs w:val="17"/>
+        </w:rPr>
+        <w:t xml:space="preserve">Gancho en pantalla: MI REGLA PARA CUALQUIER EMPRENDEDOR.</w:t>
+      </w:r>
+    </w:p>
+    <w:p>
+      <w:pPr>
+        <w:keepNext/>
+        <w:spacing w:after="60"/>
+      </w:pPr>
+      <w:r>
+        <w:rPr>
+          <w:rFonts w:ascii="Arial" w:cs="Arial" w:eastAsia="Arial" w:hAnsi="Arial"/>
+          <w:i/>
+          <w:iCs/>
+          <w:color w:val="5B5B57"/>
+          <w:sz w:val="17"/>
+          <w:szCs w:val="17"/>
+        </w:rPr>
+        <w:t xml:space="preserve">Cómo grabarlo: Tú a cámara; texto "WHATSAPP PARA ATENDER. LINK PARA AGENDAR."</w:t>
       </w:r>
     </w:p>
     <w:p>
@@ -3403,7 +4133,7 @@
         <w:rPr>
           <w:rFonts w:ascii="Arial" w:cs="Arial" w:eastAsia="Arial" w:hAnsi="Arial"/>
         </w:rPr>
-        <w:t xml:space="preserve">FYP-S03-VIE-P3.mp4</w:t>
+        <w:t xml:space="preserve">FYP-S03-VIE-CAM.mp4</w:t>
       </w:r>
     </w:p>
     <w:p>
@@ -3454,7 +4184,24 @@
           <w:sz w:val="28"/>
           <w:szCs w:val="28"/>
         </w:rPr>
-        <w:t xml:space="preserve">«Se termina mi primer mes con bookeaa. Gracias a todos los que comentaron, compartieron y probaron. Si trabajas con citas, el primer mes es gratis: link en el perfil.»</w:t>
+        <w:t xml:space="preserve">«Se termina mi primer mes con bookeaa. Gracias a todos los que comentaron y compartieron. Si trabajas con citas y quieres organizar tu tiempo como los negocios que crecen, el primer mes es gratis. Link en mi perfil.»</w:t>
+      </w:r>
+    </w:p>
+    <w:p>
+      <w:pPr>
+        <w:keepNext/>
+        <w:spacing w:after="40"/>
+      </w:pPr>
+      <w:r>
+        <w:rPr>
+          <w:rFonts w:ascii="Arial" w:cs="Arial" w:eastAsia="Arial" w:hAnsi="Arial"/>
+          <w:i/>
+          <w:iCs/>
+          <w:color w:val="5B5B57"/>
+          <w:sz w:val="17"/>
+          <w:szCs w:val="17"/>
+        </w:rPr>
+        <w:t xml:space="preserve">Gancho en pantalla: MI PRIMER MES COMO EMPRENDEDOR.</w:t>
       </w:r>
     </w:p>
     <w:p>
@@ -3471,7 +4218,7 @@
           <w:sz w:val="17"/>
           <w:szCs w:val="17"/>
         </w:rPr>
-        <w:t xml:space="preserve">En pantalla: GRACIAS. 1 MES GRATIS.</w:t>
+        <w:t xml:space="preserve">Cómo grabarlo: Tú a cámara, cerrando el mes.</w:t>
       </w:r>
     </w:p>
     <w:p>

</xml_diff>